<commit_message>
Add master abbreviation lists + report-wide first-use expansion; Ch.4 citation fixes
Preserves pre-revision polish on the full draft before applying Jerome's
6 June review instructions: per-report List of Abbreviations, first-use
spell-outs across all chapters, Ch.4 (iron & steel) citation fixes, and the
expand_acronyms.py tool. Rebuilt both Word drafts.

Co-Authored-By: Claude Opus 4.8 <noreply@anthropic.com>
</commit_message>
<xml_diff>
--- a/report/Report-1-Iron-Steel-Copper-Automotive.docx
+++ b/report/Report-1-Iron-Steel-Copper-Automotive.docx
@@ -111,6 +111,2051 @@
         <w:pStyle w:val="Heading1"/>
       </w:pPr>
       <w:r>
+        <w:t>List of Abbreviations</w:t>
+      </w:r>
+    </w:p>
+    <w:p>
+      <w:r>
+        <w:t>The following abbreviations are used throughout Report 1. Each is also spelled out in full at its first use in the text.</w:t>
+      </w:r>
+    </w:p>
+    <w:tbl>
+      <w:tblPr>
+        <w:tblStyle w:val="TableGrid"/>
+        <w:tblW w:type="auto" w:w="0"/>
+        <w:jc w:val="left"/>
+        <w:tblLook w:firstColumn="1" w:firstRow="1" w:lastColumn="0" w:lastRow="0" w:noHBand="0" w:noVBand="1" w:val="04A0"/>
+      </w:tblPr>
+      <w:tblGrid>
+        <w:gridCol w:w="4703"/>
+        <w:gridCol w:w="4703"/>
+      </w:tblGrid>
+      <w:tr>
+        <w:tc>
+          <w:tcPr>
+            <w:tcW w:type="dxa" w:w="4703"/>
+            <w:shd w:val="clear" w:color="auto" w:fill="002B5B"/>
+          </w:tcPr>
+          <w:p>
+            <w:r>
+              <w:rPr>
+                <w:b/>
+                <w:color w:val="FFFFFF"/>
+                <w:sz w:val="18"/>
+              </w:rPr>
+              <w:t>Abbreviation</w:t>
+            </w:r>
+          </w:p>
+        </w:tc>
+        <w:tc>
+          <w:tcPr>
+            <w:tcW w:type="dxa" w:w="4703"/>
+            <w:shd w:val="clear" w:color="auto" w:fill="002B5B"/>
+          </w:tcPr>
+          <w:p>
+            <w:r>
+              <w:rPr>
+                <w:b/>
+                <w:color w:val="FFFFFF"/>
+                <w:sz w:val="18"/>
+              </w:rPr>
+              <w:t>Full form</w:t>
+            </w:r>
+          </w:p>
+        </w:tc>
+      </w:tr>
+      <w:tr>
+        <w:tc>
+          <w:tcPr>
+            <w:tcW w:type="dxa" w:w="4703"/>
+            <w:shd w:val="clear" w:color="auto" w:fill="EEF3F9"/>
+          </w:tcPr>
+          <w:p>
+            <w:r>
+              <w:rPr>
+                <w:sz w:val="18"/>
+              </w:rPr>
+              <w:t>ATMs</w:t>
+            </w:r>
+          </w:p>
+        </w:tc>
+        <w:tc>
+          <w:tcPr>
+            <w:tcW w:type="dxa" w:w="4703"/>
+            <w:shd w:val="clear" w:color="auto" w:fill="EEF3F9"/>
+          </w:tcPr>
+          <w:p>
+            <w:r>
+              <w:rPr>
+                <w:sz w:val="18"/>
+              </w:rPr>
+              <w:t>Agro-industrialization, Tourism, Minerals, and Science, Technology &amp; Innovation (Tenfold Growth Strategy pillars)</w:t>
+            </w:r>
+          </w:p>
+        </w:tc>
+      </w:tr>
+      <w:tr>
+        <w:tc>
+          <w:tcPr>
+            <w:tcW w:type="dxa" w:w="4703"/>
+            <w:shd w:val="clear" w:color="auto" w:fill="FFFFFF"/>
+          </w:tcPr>
+          <w:p>
+            <w:r>
+              <w:rPr>
+                <w:sz w:val="18"/>
+              </w:rPr>
+              <w:t>BRT</w:t>
+            </w:r>
+          </w:p>
+        </w:tc>
+        <w:tc>
+          <w:tcPr>
+            <w:tcW w:type="dxa" w:w="4703"/>
+            <w:shd w:val="clear" w:color="auto" w:fill="FFFFFF"/>
+          </w:tcPr>
+          <w:p>
+            <w:r>
+              <w:rPr>
+                <w:sz w:val="18"/>
+              </w:rPr>
+              <w:t>Bus Rapid Transit</w:t>
+            </w:r>
+          </w:p>
+        </w:tc>
+      </w:tr>
+      <w:tr>
+        <w:tc>
+          <w:tcPr>
+            <w:tcW w:type="dxa" w:w="4703"/>
+            <w:shd w:val="clear" w:color="auto" w:fill="EEF3F9"/>
+          </w:tcPr>
+          <w:p>
+            <w:r>
+              <w:rPr>
+                <w:sz w:val="18"/>
+              </w:rPr>
+              <w:t>CAPEX</w:t>
+            </w:r>
+          </w:p>
+        </w:tc>
+        <w:tc>
+          <w:tcPr>
+            <w:tcW w:type="dxa" w:w="4703"/>
+            <w:shd w:val="clear" w:color="auto" w:fill="EEF3F9"/>
+          </w:tcPr>
+          <w:p>
+            <w:r>
+              <w:rPr>
+                <w:sz w:val="18"/>
+              </w:rPr>
+              <w:t>Capital expenditure</w:t>
+            </w:r>
+          </w:p>
+        </w:tc>
+      </w:tr>
+      <w:tr>
+        <w:tc>
+          <w:tcPr>
+            <w:tcW w:type="dxa" w:w="4703"/>
+            <w:shd w:val="clear" w:color="auto" w:fill="FFFFFF"/>
+          </w:tcPr>
+          <w:p>
+            <w:r>
+              <w:rPr>
+                <w:sz w:val="18"/>
+              </w:rPr>
+              <w:t>CET</w:t>
+            </w:r>
+          </w:p>
+        </w:tc>
+        <w:tc>
+          <w:tcPr>
+            <w:tcW w:type="dxa" w:w="4703"/>
+            <w:shd w:val="clear" w:color="auto" w:fill="FFFFFF"/>
+          </w:tcPr>
+          <w:p>
+            <w:r>
+              <w:rPr>
+                <w:sz w:val="18"/>
+              </w:rPr>
+              <w:t>Common External Tariff</w:t>
+            </w:r>
+          </w:p>
+        </w:tc>
+      </w:tr>
+      <w:tr>
+        <w:tc>
+          <w:tcPr>
+            <w:tcW w:type="dxa" w:w="4703"/>
+            <w:shd w:val="clear" w:color="auto" w:fill="EEF3F9"/>
+          </w:tcPr>
+          <w:p>
+            <w:r>
+              <w:rPr>
+                <w:sz w:val="18"/>
+              </w:rPr>
+              <w:t>CKD</w:t>
+            </w:r>
+          </w:p>
+        </w:tc>
+        <w:tc>
+          <w:tcPr>
+            <w:tcW w:type="dxa" w:w="4703"/>
+            <w:shd w:val="clear" w:color="auto" w:fill="EEF3F9"/>
+          </w:tcPr>
+          <w:p>
+            <w:r>
+              <w:rPr>
+                <w:sz w:val="18"/>
+              </w:rPr>
+              <w:t>Completely Knocked Down (vehicle assembly kits)</w:t>
+            </w:r>
+          </w:p>
+        </w:tc>
+      </w:tr>
+      <w:tr>
+        <w:tc>
+          <w:tcPr>
+            <w:tcW w:type="dxa" w:w="4703"/>
+            <w:shd w:val="clear" w:color="auto" w:fill="FFFFFF"/>
+          </w:tcPr>
+          <w:p>
+            <w:r>
+              <w:rPr>
+                <w:sz w:val="18"/>
+              </w:rPr>
+              <w:t>COMESA</w:t>
+            </w:r>
+          </w:p>
+        </w:tc>
+        <w:tc>
+          <w:tcPr>
+            <w:tcW w:type="dxa" w:w="4703"/>
+            <w:shd w:val="clear" w:color="auto" w:fill="FFFFFF"/>
+          </w:tcPr>
+          <w:p>
+            <w:r>
+              <w:rPr>
+                <w:sz w:val="18"/>
+              </w:rPr>
+              <w:t>Common Market for Eastern and Southern Africa</w:t>
+            </w:r>
+          </w:p>
+        </w:tc>
+      </w:tr>
+      <w:tr>
+        <w:tc>
+          <w:tcPr>
+            <w:tcW w:type="dxa" w:w="4703"/>
+            <w:shd w:val="clear" w:color="auto" w:fill="EEF3F9"/>
+          </w:tcPr>
+          <w:p>
+            <w:r>
+              <w:rPr>
+                <w:sz w:val="18"/>
+              </w:rPr>
+              <w:t>DGSM</w:t>
+            </w:r>
+          </w:p>
+        </w:tc>
+        <w:tc>
+          <w:tcPr>
+            <w:tcW w:type="dxa" w:w="4703"/>
+            <w:shd w:val="clear" w:color="auto" w:fill="EEF3F9"/>
+          </w:tcPr>
+          <w:p>
+            <w:r>
+              <w:rPr>
+                <w:sz w:val="18"/>
+              </w:rPr>
+              <w:t>Directorate of Geological Survey and Mines</w:t>
+            </w:r>
+          </w:p>
+        </w:tc>
+      </w:tr>
+      <w:tr>
+        <w:tc>
+          <w:tcPr>
+            <w:tcW w:type="dxa" w:w="4703"/>
+            <w:shd w:val="clear" w:color="auto" w:fill="FFFFFF"/>
+          </w:tcPr>
+          <w:p>
+            <w:r>
+              <w:rPr>
+                <w:sz w:val="18"/>
+              </w:rPr>
+              <w:t>DRC</w:t>
+            </w:r>
+          </w:p>
+        </w:tc>
+        <w:tc>
+          <w:tcPr>
+            <w:tcW w:type="dxa" w:w="4703"/>
+            <w:shd w:val="clear" w:color="auto" w:fill="FFFFFF"/>
+          </w:tcPr>
+          <w:p>
+            <w:r>
+              <w:rPr>
+                <w:sz w:val="18"/>
+              </w:rPr>
+              <w:t>Democratic Republic of Congo</w:t>
+            </w:r>
+          </w:p>
+        </w:tc>
+      </w:tr>
+      <w:tr>
+        <w:tc>
+          <w:tcPr>
+            <w:tcW w:type="dxa" w:w="4703"/>
+            <w:shd w:val="clear" w:color="auto" w:fill="EEF3F9"/>
+          </w:tcPr>
+          <w:p>
+            <w:r>
+              <w:rPr>
+                <w:sz w:val="18"/>
+              </w:rPr>
+              <w:t>DRI</w:t>
+            </w:r>
+          </w:p>
+        </w:tc>
+        <w:tc>
+          <w:tcPr>
+            <w:tcW w:type="dxa" w:w="4703"/>
+            <w:shd w:val="clear" w:color="auto" w:fill="EEF3F9"/>
+          </w:tcPr>
+          <w:p>
+            <w:r>
+              <w:rPr>
+                <w:sz w:val="18"/>
+              </w:rPr>
+              <w:t>Direct Reduced Iron (sponge iron)</w:t>
+            </w:r>
+          </w:p>
+        </w:tc>
+      </w:tr>
+      <w:tr>
+        <w:tc>
+          <w:tcPr>
+            <w:tcW w:type="dxa" w:w="4703"/>
+            <w:shd w:val="clear" w:color="auto" w:fill="FFFFFF"/>
+          </w:tcPr>
+          <w:p>
+            <w:r>
+              <w:rPr>
+                <w:sz w:val="18"/>
+              </w:rPr>
+              <w:t>EAC</w:t>
+            </w:r>
+          </w:p>
+        </w:tc>
+        <w:tc>
+          <w:tcPr>
+            <w:tcW w:type="dxa" w:w="4703"/>
+            <w:shd w:val="clear" w:color="auto" w:fill="FFFFFF"/>
+          </w:tcPr>
+          <w:p>
+            <w:r>
+              <w:rPr>
+                <w:sz w:val="18"/>
+              </w:rPr>
+              <w:t>East African Community</w:t>
+            </w:r>
+          </w:p>
+        </w:tc>
+      </w:tr>
+      <w:tr>
+        <w:tc>
+          <w:tcPr>
+            <w:tcW w:type="dxa" w:w="4703"/>
+            <w:shd w:val="clear" w:color="auto" w:fill="EEF3F9"/>
+          </w:tcPr>
+          <w:p>
+            <w:r>
+              <w:rPr>
+                <w:sz w:val="18"/>
+              </w:rPr>
+              <w:t>EADB</w:t>
+            </w:r>
+          </w:p>
+        </w:tc>
+        <w:tc>
+          <w:tcPr>
+            <w:tcW w:type="dxa" w:w="4703"/>
+            <w:shd w:val="clear" w:color="auto" w:fill="EEF3F9"/>
+          </w:tcPr>
+          <w:p>
+            <w:r>
+              <w:rPr>
+                <w:sz w:val="18"/>
+              </w:rPr>
+              <w:t>East African Development Bank</w:t>
+            </w:r>
+          </w:p>
+        </w:tc>
+      </w:tr>
+      <w:tr>
+        <w:tc>
+          <w:tcPr>
+            <w:tcW w:type="dxa" w:w="4703"/>
+            <w:shd w:val="clear" w:color="auto" w:fill="FFFFFF"/>
+          </w:tcPr>
+          <w:p>
+            <w:r>
+              <w:rPr>
+                <w:sz w:val="18"/>
+              </w:rPr>
+              <w:t>EAF</w:t>
+            </w:r>
+          </w:p>
+        </w:tc>
+        <w:tc>
+          <w:tcPr>
+            <w:tcW w:type="dxa" w:w="4703"/>
+            <w:shd w:val="clear" w:color="auto" w:fill="FFFFFF"/>
+          </w:tcPr>
+          <w:p>
+            <w:r>
+              <w:rPr>
+                <w:sz w:val="18"/>
+              </w:rPr>
+              <w:t>Electric Arc Furnace</w:t>
+            </w:r>
+          </w:p>
+        </w:tc>
+      </w:tr>
+      <w:tr>
+        <w:tc>
+          <w:tcPr>
+            <w:tcW w:type="dxa" w:w="4703"/>
+            <w:shd w:val="clear" w:color="auto" w:fill="EEF3F9"/>
+          </w:tcPr>
+          <w:p>
+            <w:r>
+              <w:rPr>
+                <w:sz w:val="18"/>
+              </w:rPr>
+              <w:t>ERA</w:t>
+            </w:r>
+          </w:p>
+        </w:tc>
+        <w:tc>
+          <w:tcPr>
+            <w:tcW w:type="dxa" w:w="4703"/>
+            <w:shd w:val="clear" w:color="auto" w:fill="EEF3F9"/>
+          </w:tcPr>
+          <w:p>
+            <w:r>
+              <w:rPr>
+                <w:sz w:val="18"/>
+              </w:rPr>
+              <w:t>Electricity Regulatory Authority</w:t>
+            </w:r>
+          </w:p>
+        </w:tc>
+      </w:tr>
+      <w:tr>
+        <w:tc>
+          <w:tcPr>
+            <w:tcW w:type="dxa" w:w="4703"/>
+            <w:shd w:val="clear" w:color="auto" w:fill="FFFFFF"/>
+          </w:tcPr>
+          <w:p>
+            <w:r>
+              <w:rPr>
+                <w:sz w:val="18"/>
+              </w:rPr>
+              <w:t>EV</w:t>
+            </w:r>
+          </w:p>
+        </w:tc>
+        <w:tc>
+          <w:tcPr>
+            <w:tcW w:type="dxa" w:w="4703"/>
+            <w:shd w:val="clear" w:color="auto" w:fill="FFFFFF"/>
+          </w:tcPr>
+          <w:p>
+            <w:r>
+              <w:rPr>
+                <w:sz w:val="18"/>
+              </w:rPr>
+              <w:t>Electric Vehicle</w:t>
+            </w:r>
+          </w:p>
+        </w:tc>
+      </w:tr>
+      <w:tr>
+        <w:tc>
+          <w:tcPr>
+            <w:tcW w:type="dxa" w:w="4703"/>
+            <w:shd w:val="clear" w:color="auto" w:fill="EEF3F9"/>
+          </w:tcPr>
+          <w:p>
+            <w:r>
+              <w:rPr>
+                <w:sz w:val="18"/>
+              </w:rPr>
+              <w:t>FEED</w:t>
+            </w:r>
+          </w:p>
+        </w:tc>
+        <w:tc>
+          <w:tcPr>
+            <w:tcW w:type="dxa" w:w="4703"/>
+            <w:shd w:val="clear" w:color="auto" w:fill="EEF3F9"/>
+          </w:tcPr>
+          <w:p>
+            <w:r>
+              <w:rPr>
+                <w:sz w:val="18"/>
+              </w:rPr>
+              <w:t>Front-End Engineering Design</w:t>
+            </w:r>
+          </w:p>
+        </w:tc>
+      </w:tr>
+      <w:tr>
+        <w:tc>
+          <w:tcPr>
+            <w:tcW w:type="dxa" w:w="4703"/>
+            <w:shd w:val="clear" w:color="auto" w:fill="FFFFFF"/>
+          </w:tcPr>
+          <w:p>
+            <w:r>
+              <w:rPr>
+                <w:sz w:val="18"/>
+              </w:rPr>
+              <w:t>FY</w:t>
+            </w:r>
+          </w:p>
+        </w:tc>
+        <w:tc>
+          <w:tcPr>
+            <w:tcW w:type="dxa" w:w="4703"/>
+            <w:shd w:val="clear" w:color="auto" w:fill="FFFFFF"/>
+          </w:tcPr>
+          <w:p>
+            <w:r>
+              <w:rPr>
+                <w:sz w:val="18"/>
+              </w:rPr>
+              <w:t>Financial Year</w:t>
+            </w:r>
+          </w:p>
+        </w:tc>
+      </w:tr>
+      <w:tr>
+        <w:tc>
+          <w:tcPr>
+            <w:tcW w:type="dxa" w:w="4703"/>
+            <w:shd w:val="clear" w:color="auto" w:fill="EEF3F9"/>
+          </w:tcPr>
+          <w:p>
+            <w:r>
+              <w:rPr>
+                <w:sz w:val="18"/>
+              </w:rPr>
+              <w:t>GDP</w:t>
+            </w:r>
+          </w:p>
+        </w:tc>
+        <w:tc>
+          <w:tcPr>
+            <w:tcW w:type="dxa" w:w="4703"/>
+            <w:shd w:val="clear" w:color="auto" w:fill="EEF3F9"/>
+          </w:tcPr>
+          <w:p>
+            <w:r>
+              <w:rPr>
+                <w:sz w:val="18"/>
+              </w:rPr>
+              <w:t>Gross Domestic Product</w:t>
+            </w:r>
+          </w:p>
+        </w:tc>
+      </w:tr>
+      <w:tr>
+        <w:tc>
+          <w:tcPr>
+            <w:tcW w:type="dxa" w:w="4703"/>
+            <w:shd w:val="clear" w:color="auto" w:fill="FFFFFF"/>
+          </w:tcPr>
+          <w:p>
+            <w:r>
+              <w:rPr>
+                <w:sz w:val="18"/>
+              </w:rPr>
+              <w:t>HS</w:t>
+            </w:r>
+          </w:p>
+        </w:tc>
+        <w:tc>
+          <w:tcPr>
+            <w:tcW w:type="dxa" w:w="4703"/>
+            <w:shd w:val="clear" w:color="auto" w:fill="FFFFFF"/>
+          </w:tcPr>
+          <w:p>
+            <w:r>
+              <w:rPr>
+                <w:sz w:val="18"/>
+              </w:rPr>
+              <w:t>Harmonized System (trade classification code)</w:t>
+            </w:r>
+          </w:p>
+        </w:tc>
+      </w:tr>
+      <w:tr>
+        <w:tc>
+          <w:tcPr>
+            <w:tcW w:type="dxa" w:w="4703"/>
+            <w:shd w:val="clear" w:color="auto" w:fill="EEF3F9"/>
+          </w:tcPr>
+          <w:p>
+            <w:r>
+              <w:rPr>
+                <w:sz w:val="18"/>
+              </w:rPr>
+              <w:t>ICSG</w:t>
+            </w:r>
+          </w:p>
+        </w:tc>
+        <w:tc>
+          <w:tcPr>
+            <w:tcW w:type="dxa" w:w="4703"/>
+            <w:shd w:val="clear" w:color="auto" w:fill="EEF3F9"/>
+          </w:tcPr>
+          <w:p>
+            <w:r>
+              <w:rPr>
+                <w:sz w:val="18"/>
+              </w:rPr>
+              <w:t>International Copper Study Group</w:t>
+            </w:r>
+          </w:p>
+        </w:tc>
+      </w:tr>
+      <w:tr>
+        <w:tc>
+          <w:tcPr>
+            <w:tcW w:type="dxa" w:w="4703"/>
+            <w:shd w:val="clear" w:color="auto" w:fill="FFFFFF"/>
+          </w:tcPr>
+          <w:p>
+            <w:r>
+              <w:rPr>
+                <w:sz w:val="18"/>
+              </w:rPr>
+              <w:t>ISID</w:t>
+            </w:r>
+          </w:p>
+        </w:tc>
+        <w:tc>
+          <w:tcPr>
+            <w:tcW w:type="dxa" w:w="4703"/>
+            <w:shd w:val="clear" w:color="auto" w:fill="FFFFFF"/>
+          </w:tcPr>
+          <w:p>
+            <w:r>
+              <w:rPr>
+                <w:sz w:val="18"/>
+              </w:rPr>
+              <w:t>Inclusive and Sustainable Industrial Development</w:t>
+            </w:r>
+          </w:p>
+        </w:tc>
+      </w:tr>
+      <w:tr>
+        <w:tc>
+          <w:tcPr>
+            <w:tcW w:type="dxa" w:w="4703"/>
+            <w:shd w:val="clear" w:color="auto" w:fill="EEF3F9"/>
+          </w:tcPr>
+          <w:p>
+            <w:r>
+              <w:rPr>
+                <w:sz w:val="18"/>
+              </w:rPr>
+              <w:t>ITC</w:t>
+            </w:r>
+          </w:p>
+        </w:tc>
+        <w:tc>
+          <w:tcPr>
+            <w:tcW w:type="dxa" w:w="4703"/>
+            <w:shd w:val="clear" w:color="auto" w:fill="EEF3F9"/>
+          </w:tcPr>
+          <w:p>
+            <w:r>
+              <w:rPr>
+                <w:sz w:val="18"/>
+              </w:rPr>
+              <w:t>International Trade Centre</w:t>
+            </w:r>
+          </w:p>
+        </w:tc>
+      </w:tr>
+      <w:tr>
+        <w:tc>
+          <w:tcPr>
+            <w:tcW w:type="dxa" w:w="4703"/>
+            <w:shd w:val="clear" w:color="auto" w:fill="FFFFFF"/>
+          </w:tcPr>
+          <w:p>
+            <w:r>
+              <w:rPr>
+                <w:sz w:val="18"/>
+              </w:rPr>
+              <w:t>KII</w:t>
+            </w:r>
+          </w:p>
+        </w:tc>
+        <w:tc>
+          <w:tcPr>
+            <w:tcW w:type="dxa" w:w="4703"/>
+            <w:shd w:val="clear" w:color="auto" w:fill="FFFFFF"/>
+          </w:tcPr>
+          <w:p>
+            <w:r>
+              <w:rPr>
+                <w:sz w:val="18"/>
+              </w:rPr>
+              <w:t>Key Informant Interview</w:t>
+            </w:r>
+          </w:p>
+        </w:tc>
+      </w:tr>
+      <w:tr>
+        <w:tc>
+          <w:tcPr>
+            <w:tcW w:type="dxa" w:w="4703"/>
+            <w:shd w:val="clear" w:color="auto" w:fill="EEF3F9"/>
+          </w:tcPr>
+          <w:p>
+            <w:r>
+              <w:rPr>
+                <w:sz w:val="18"/>
+              </w:rPr>
+              <w:t>KMC</w:t>
+            </w:r>
+          </w:p>
+        </w:tc>
+        <w:tc>
+          <w:tcPr>
+            <w:tcW w:type="dxa" w:w="4703"/>
+            <w:shd w:val="clear" w:color="auto" w:fill="EEF3F9"/>
+          </w:tcPr>
+          <w:p>
+            <w:r>
+              <w:rPr>
+                <w:sz w:val="18"/>
+              </w:rPr>
+              <w:t>Kiira Motors Corporation</w:t>
+            </w:r>
+          </w:p>
+        </w:tc>
+      </w:tr>
+      <w:tr>
+        <w:tc>
+          <w:tcPr>
+            <w:tcW w:type="dxa" w:w="4703"/>
+            <w:shd w:val="clear" w:color="auto" w:fill="FFFFFF"/>
+          </w:tcPr>
+          <w:p>
+            <w:r>
+              <w:rPr>
+                <w:sz w:val="18"/>
+              </w:rPr>
+              <w:t>MDAs</w:t>
+            </w:r>
+          </w:p>
+        </w:tc>
+        <w:tc>
+          <w:tcPr>
+            <w:tcW w:type="dxa" w:w="4703"/>
+            <w:shd w:val="clear" w:color="auto" w:fill="FFFFFF"/>
+          </w:tcPr>
+          <w:p>
+            <w:r>
+              <w:rPr>
+                <w:sz w:val="18"/>
+              </w:rPr>
+              <w:t>Ministries, Departments and Agencies</w:t>
+            </w:r>
+          </w:p>
+        </w:tc>
+      </w:tr>
+      <w:tr>
+        <w:tc>
+          <w:tcPr>
+            <w:tcW w:type="dxa" w:w="4703"/>
+            <w:shd w:val="clear" w:color="auto" w:fill="EEF3F9"/>
+          </w:tcPr>
+          <w:p>
+            <w:r>
+              <w:rPr>
+                <w:sz w:val="18"/>
+              </w:rPr>
+              <w:t>MEMD</w:t>
+            </w:r>
+          </w:p>
+        </w:tc>
+        <w:tc>
+          <w:tcPr>
+            <w:tcW w:type="dxa" w:w="4703"/>
+            <w:shd w:val="clear" w:color="auto" w:fill="EEF3F9"/>
+          </w:tcPr>
+          <w:p>
+            <w:r>
+              <w:rPr>
+                <w:sz w:val="18"/>
+              </w:rPr>
+              <w:t>Ministry of Energy and Mineral Development</w:t>
+            </w:r>
+          </w:p>
+        </w:tc>
+      </w:tr>
+      <w:tr>
+        <w:tc>
+          <w:tcPr>
+            <w:tcW w:type="dxa" w:w="4703"/>
+            <w:shd w:val="clear" w:color="auto" w:fill="FFFFFF"/>
+          </w:tcPr>
+          <w:p>
+            <w:r>
+              <w:rPr>
+                <w:sz w:val="18"/>
+              </w:rPr>
+              <w:t>MoES</w:t>
+            </w:r>
+          </w:p>
+        </w:tc>
+        <w:tc>
+          <w:tcPr>
+            <w:tcW w:type="dxa" w:w="4703"/>
+            <w:shd w:val="clear" w:color="auto" w:fill="FFFFFF"/>
+          </w:tcPr>
+          <w:p>
+            <w:r>
+              <w:rPr>
+                <w:sz w:val="18"/>
+              </w:rPr>
+              <w:t>Ministry of Education and Sports</w:t>
+            </w:r>
+          </w:p>
+        </w:tc>
+      </w:tr>
+      <w:tr>
+        <w:tc>
+          <w:tcPr>
+            <w:tcW w:type="dxa" w:w="4703"/>
+            <w:shd w:val="clear" w:color="auto" w:fill="EEF3F9"/>
+          </w:tcPr>
+          <w:p>
+            <w:r>
+              <w:rPr>
+                <w:sz w:val="18"/>
+              </w:rPr>
+              <w:t>MoFPED</w:t>
+            </w:r>
+          </w:p>
+        </w:tc>
+        <w:tc>
+          <w:tcPr>
+            <w:tcW w:type="dxa" w:w="4703"/>
+            <w:shd w:val="clear" w:color="auto" w:fill="EEF3F9"/>
+          </w:tcPr>
+          <w:p>
+            <w:r>
+              <w:rPr>
+                <w:sz w:val="18"/>
+              </w:rPr>
+              <w:t>Ministry of Finance, Planning and Economic Development</w:t>
+            </w:r>
+          </w:p>
+        </w:tc>
+      </w:tr>
+      <w:tr>
+        <w:tc>
+          <w:tcPr>
+            <w:tcW w:type="dxa" w:w="4703"/>
+            <w:shd w:val="clear" w:color="auto" w:fill="FFFFFF"/>
+          </w:tcPr>
+          <w:p>
+            <w:r>
+              <w:rPr>
+                <w:sz w:val="18"/>
+              </w:rPr>
+              <w:t>MoWT</w:t>
+            </w:r>
+          </w:p>
+        </w:tc>
+        <w:tc>
+          <w:tcPr>
+            <w:tcW w:type="dxa" w:w="4703"/>
+            <w:shd w:val="clear" w:color="auto" w:fill="FFFFFF"/>
+          </w:tcPr>
+          <w:p>
+            <w:r>
+              <w:rPr>
+                <w:sz w:val="18"/>
+              </w:rPr>
+              <w:t>Ministry of Works and Transport</w:t>
+            </w:r>
+          </w:p>
+        </w:tc>
+      </w:tr>
+      <w:tr>
+        <w:tc>
+          <w:tcPr>
+            <w:tcW w:type="dxa" w:w="4703"/>
+            <w:shd w:val="clear" w:color="auto" w:fill="EEF3F9"/>
+          </w:tcPr>
+          <w:p>
+            <w:r>
+              <w:rPr>
+                <w:sz w:val="18"/>
+              </w:rPr>
+              <w:t>MTIC</w:t>
+            </w:r>
+          </w:p>
+        </w:tc>
+        <w:tc>
+          <w:tcPr>
+            <w:tcW w:type="dxa" w:w="4703"/>
+            <w:shd w:val="clear" w:color="auto" w:fill="EEF3F9"/>
+          </w:tcPr>
+          <w:p>
+            <w:r>
+              <w:rPr>
+                <w:sz w:val="18"/>
+              </w:rPr>
+              <w:t>Ministry of Trade, Industry and Cooperatives</w:t>
+            </w:r>
+          </w:p>
+        </w:tc>
+      </w:tr>
+      <w:tr>
+        <w:tc>
+          <w:tcPr>
+            <w:tcW w:type="dxa" w:w="4703"/>
+            <w:shd w:val="clear" w:color="auto" w:fill="FFFFFF"/>
+          </w:tcPr>
+          <w:p>
+            <w:r>
+              <w:rPr>
+                <w:sz w:val="18"/>
+              </w:rPr>
+              <w:t>NDP IV</w:t>
+            </w:r>
+          </w:p>
+        </w:tc>
+        <w:tc>
+          <w:tcPr>
+            <w:tcW w:type="dxa" w:w="4703"/>
+            <w:shd w:val="clear" w:color="auto" w:fill="FFFFFF"/>
+          </w:tcPr>
+          <w:p>
+            <w:r>
+              <w:rPr>
+                <w:sz w:val="18"/>
+              </w:rPr>
+              <w:t>Fourth National Development Plan</w:t>
+            </w:r>
+          </w:p>
+        </w:tc>
+      </w:tr>
+      <w:tr>
+        <w:tc>
+          <w:tcPr>
+            <w:tcW w:type="dxa" w:w="4703"/>
+            <w:shd w:val="clear" w:color="auto" w:fill="EEF3F9"/>
+          </w:tcPr>
+          <w:p>
+            <w:r>
+              <w:rPr>
+                <w:sz w:val="18"/>
+              </w:rPr>
+              <w:t>NEMA</w:t>
+            </w:r>
+          </w:p>
+        </w:tc>
+        <w:tc>
+          <w:tcPr>
+            <w:tcW w:type="dxa" w:w="4703"/>
+            <w:shd w:val="clear" w:color="auto" w:fill="EEF3F9"/>
+          </w:tcPr>
+          <w:p>
+            <w:r>
+              <w:rPr>
+                <w:sz w:val="18"/>
+              </w:rPr>
+              <w:t>National Environment Management Authority</w:t>
+            </w:r>
+          </w:p>
+        </w:tc>
+      </w:tr>
+      <w:tr>
+        <w:tc>
+          <w:tcPr>
+            <w:tcW w:type="dxa" w:w="4703"/>
+            <w:shd w:val="clear" w:color="auto" w:fill="FFFFFF"/>
+          </w:tcPr>
+          <w:p>
+            <w:r>
+              <w:rPr>
+                <w:sz w:val="18"/>
+              </w:rPr>
+              <w:t>NIP</w:t>
+            </w:r>
+          </w:p>
+        </w:tc>
+        <w:tc>
+          <w:tcPr>
+            <w:tcW w:type="dxa" w:w="4703"/>
+            <w:shd w:val="clear" w:color="auto" w:fill="FFFFFF"/>
+          </w:tcPr>
+          <w:p>
+            <w:r>
+              <w:rPr>
+                <w:sz w:val="18"/>
+              </w:rPr>
+              <w:t>National Industrial Policy (2020)</w:t>
+            </w:r>
+          </w:p>
+        </w:tc>
+      </w:tr>
+      <w:tr>
+        <w:tc>
+          <w:tcPr>
+            <w:tcW w:type="dxa" w:w="4703"/>
+            <w:shd w:val="clear" w:color="auto" w:fill="EEF3F9"/>
+          </w:tcPr>
+          <w:p>
+            <w:r>
+              <w:rPr>
+                <w:sz w:val="18"/>
+              </w:rPr>
+              <w:t>NPA</w:t>
+            </w:r>
+          </w:p>
+        </w:tc>
+        <w:tc>
+          <w:tcPr>
+            <w:tcW w:type="dxa" w:w="4703"/>
+            <w:shd w:val="clear" w:color="auto" w:fill="EEF3F9"/>
+          </w:tcPr>
+          <w:p>
+            <w:r>
+              <w:rPr>
+                <w:sz w:val="18"/>
+              </w:rPr>
+              <w:t>National Planning Authority</w:t>
+            </w:r>
+          </w:p>
+        </w:tc>
+      </w:tr>
+      <w:tr>
+        <w:tc>
+          <w:tcPr>
+            <w:tcW w:type="dxa" w:w="4703"/>
+            <w:shd w:val="clear" w:color="auto" w:fill="FFFFFF"/>
+          </w:tcPr>
+          <w:p>
+            <w:r>
+              <w:rPr>
+                <w:sz w:val="18"/>
+              </w:rPr>
+              <w:t>NTBs</w:t>
+            </w:r>
+          </w:p>
+        </w:tc>
+        <w:tc>
+          <w:tcPr>
+            <w:tcW w:type="dxa" w:w="4703"/>
+            <w:shd w:val="clear" w:color="auto" w:fill="FFFFFF"/>
+          </w:tcPr>
+          <w:p>
+            <w:r>
+              <w:rPr>
+                <w:sz w:val="18"/>
+              </w:rPr>
+              <w:t>Non-Tariff Barriers</w:t>
+            </w:r>
+          </w:p>
+        </w:tc>
+      </w:tr>
+      <w:tr>
+        <w:tc>
+          <w:tcPr>
+            <w:tcW w:type="dxa" w:w="4703"/>
+            <w:shd w:val="clear" w:color="auto" w:fill="EEF3F9"/>
+          </w:tcPr>
+          <w:p>
+            <w:r>
+              <w:rPr>
+                <w:sz w:val="18"/>
+              </w:rPr>
+              <w:t>NWSC</w:t>
+            </w:r>
+          </w:p>
+        </w:tc>
+        <w:tc>
+          <w:tcPr>
+            <w:tcW w:type="dxa" w:w="4703"/>
+            <w:shd w:val="clear" w:color="auto" w:fill="EEF3F9"/>
+          </w:tcPr>
+          <w:p>
+            <w:r>
+              <w:rPr>
+                <w:sz w:val="18"/>
+              </w:rPr>
+              <w:t>National Water and Sewerage Corporation</w:t>
+            </w:r>
+          </w:p>
+        </w:tc>
+      </w:tr>
+      <w:tr>
+        <w:tc>
+          <w:tcPr>
+            <w:tcW w:type="dxa" w:w="4703"/>
+            <w:shd w:val="clear" w:color="auto" w:fill="FFFFFF"/>
+          </w:tcPr>
+          <w:p>
+            <w:r>
+              <w:rPr>
+                <w:sz w:val="18"/>
+              </w:rPr>
+              <w:t>OPEX</w:t>
+            </w:r>
+          </w:p>
+        </w:tc>
+        <w:tc>
+          <w:tcPr>
+            <w:tcW w:type="dxa" w:w="4703"/>
+            <w:shd w:val="clear" w:color="auto" w:fill="FFFFFF"/>
+          </w:tcPr>
+          <w:p>
+            <w:r>
+              <w:rPr>
+                <w:sz w:val="18"/>
+              </w:rPr>
+              <w:t>Operating expenditure</w:t>
+            </w:r>
+          </w:p>
+        </w:tc>
+      </w:tr>
+      <w:tr>
+        <w:tc>
+          <w:tcPr>
+            <w:tcW w:type="dxa" w:w="4703"/>
+            <w:shd w:val="clear" w:color="auto" w:fill="EEF3F9"/>
+          </w:tcPr>
+          <w:p>
+            <w:r>
+              <w:rPr>
+                <w:sz w:val="18"/>
+              </w:rPr>
+              <w:t>PCP</w:t>
+            </w:r>
+          </w:p>
+        </w:tc>
+        <w:tc>
+          <w:tcPr>
+            <w:tcW w:type="dxa" w:w="4703"/>
+            <w:shd w:val="clear" w:color="auto" w:fill="EEF3F9"/>
+          </w:tcPr>
+          <w:p>
+            <w:r>
+              <w:rPr>
+                <w:sz w:val="18"/>
+              </w:rPr>
+              <w:t>Programme for Country Partnership</w:t>
+            </w:r>
+          </w:p>
+        </w:tc>
+      </w:tr>
+      <w:tr>
+        <w:tc>
+          <w:tcPr>
+            <w:tcW w:type="dxa" w:w="4703"/>
+            <w:shd w:val="clear" w:color="auto" w:fill="FFFFFF"/>
+          </w:tcPr>
+          <w:p>
+            <w:r>
+              <w:rPr>
+                <w:sz w:val="18"/>
+              </w:rPr>
+              <w:t>PPP</w:t>
+            </w:r>
+          </w:p>
+        </w:tc>
+        <w:tc>
+          <w:tcPr>
+            <w:tcW w:type="dxa" w:w="4703"/>
+            <w:shd w:val="clear" w:color="auto" w:fill="FFFFFF"/>
+          </w:tcPr>
+          <w:p>
+            <w:r>
+              <w:rPr>
+                <w:sz w:val="18"/>
+              </w:rPr>
+              <w:t>Public-Private Partnership</w:t>
+            </w:r>
+          </w:p>
+        </w:tc>
+      </w:tr>
+      <w:tr>
+        <w:tc>
+          <w:tcPr>
+            <w:tcW w:type="dxa" w:w="4703"/>
+            <w:shd w:val="clear" w:color="auto" w:fill="EEF3F9"/>
+          </w:tcPr>
+          <w:p>
+            <w:r>
+              <w:rPr>
+                <w:sz w:val="18"/>
+              </w:rPr>
+              <w:t>SKD</w:t>
+            </w:r>
+          </w:p>
+        </w:tc>
+        <w:tc>
+          <w:tcPr>
+            <w:tcW w:type="dxa" w:w="4703"/>
+            <w:shd w:val="clear" w:color="auto" w:fill="EEF3F9"/>
+          </w:tcPr>
+          <w:p>
+            <w:r>
+              <w:rPr>
+                <w:sz w:val="18"/>
+              </w:rPr>
+              <w:t>Semi Knocked Down (vehicle assembly kits)</w:t>
+            </w:r>
+          </w:p>
+        </w:tc>
+      </w:tr>
+      <w:tr>
+        <w:tc>
+          <w:tcPr>
+            <w:tcW w:type="dxa" w:w="4703"/>
+            <w:shd w:val="clear" w:color="auto" w:fill="FFFFFF"/>
+          </w:tcPr>
+          <w:p>
+            <w:r>
+              <w:rPr>
+                <w:sz w:val="18"/>
+              </w:rPr>
+              <w:t>STI</w:t>
+            </w:r>
+          </w:p>
+        </w:tc>
+        <w:tc>
+          <w:tcPr>
+            <w:tcW w:type="dxa" w:w="4703"/>
+            <w:shd w:val="clear" w:color="auto" w:fill="FFFFFF"/>
+          </w:tcPr>
+          <w:p>
+            <w:r>
+              <w:rPr>
+                <w:sz w:val="18"/>
+              </w:rPr>
+              <w:t>Science, Technology and Innovation</w:t>
+            </w:r>
+          </w:p>
+        </w:tc>
+      </w:tr>
+      <w:tr>
+        <w:tc>
+          <w:tcPr>
+            <w:tcW w:type="dxa" w:w="4703"/>
+            <w:shd w:val="clear" w:color="auto" w:fill="EEF3F9"/>
+          </w:tcPr>
+          <w:p>
+            <w:r>
+              <w:rPr>
+                <w:sz w:val="18"/>
+              </w:rPr>
+              <w:t>STIL</w:t>
+            </w:r>
+          </w:p>
+        </w:tc>
+        <w:tc>
+          <w:tcPr>
+            <w:tcW w:type="dxa" w:w="4703"/>
+            <w:shd w:val="clear" w:color="auto" w:fill="EEF3F9"/>
+          </w:tcPr>
+          <w:p>
+            <w:r>
+              <w:rPr>
+                <w:sz w:val="18"/>
+              </w:rPr>
+              <w:t>Steel &amp; Tube Industries Limited</w:t>
+            </w:r>
+          </w:p>
+        </w:tc>
+      </w:tr>
+      <w:tr>
+        <w:tc>
+          <w:tcPr>
+            <w:tcW w:type="dxa" w:w="4703"/>
+            <w:shd w:val="clear" w:color="auto" w:fill="FFFFFF"/>
+          </w:tcPr>
+          <w:p>
+            <w:r>
+              <w:rPr>
+                <w:sz w:val="18"/>
+              </w:rPr>
+              <w:t>ToR</w:t>
+            </w:r>
+          </w:p>
+        </w:tc>
+        <w:tc>
+          <w:tcPr>
+            <w:tcW w:type="dxa" w:w="4703"/>
+            <w:shd w:val="clear" w:color="auto" w:fill="FFFFFF"/>
+          </w:tcPr>
+          <w:p>
+            <w:r>
+              <w:rPr>
+                <w:sz w:val="18"/>
+              </w:rPr>
+              <w:t>Terms of Reference</w:t>
+            </w:r>
+          </w:p>
+        </w:tc>
+      </w:tr>
+      <w:tr>
+        <w:tc>
+          <w:tcPr>
+            <w:tcW w:type="dxa" w:w="4703"/>
+            <w:shd w:val="clear" w:color="auto" w:fill="EEF3F9"/>
+          </w:tcPr>
+          <w:p>
+            <w:r>
+              <w:rPr>
+                <w:sz w:val="18"/>
+              </w:rPr>
+              <w:t>tpa</w:t>
+            </w:r>
+          </w:p>
+        </w:tc>
+        <w:tc>
+          <w:tcPr>
+            <w:tcW w:type="dxa" w:w="4703"/>
+            <w:shd w:val="clear" w:color="auto" w:fill="EEF3F9"/>
+          </w:tcPr>
+          <w:p>
+            <w:r>
+              <w:rPr>
+                <w:sz w:val="18"/>
+              </w:rPr>
+              <w:t>Tonnes per annum</w:t>
+            </w:r>
+          </w:p>
+        </w:tc>
+      </w:tr>
+      <w:tr>
+        <w:tc>
+          <w:tcPr>
+            <w:tcW w:type="dxa" w:w="4703"/>
+            <w:shd w:val="clear" w:color="auto" w:fill="FFFFFF"/>
+          </w:tcPr>
+          <w:p>
+            <w:r>
+              <w:rPr>
+                <w:sz w:val="18"/>
+              </w:rPr>
+              <w:t>TVET</w:t>
+            </w:r>
+          </w:p>
+        </w:tc>
+        <w:tc>
+          <w:tcPr>
+            <w:tcW w:type="dxa" w:w="4703"/>
+            <w:shd w:val="clear" w:color="auto" w:fill="FFFFFF"/>
+          </w:tcPr>
+          <w:p>
+            <w:r>
+              <w:rPr>
+                <w:sz w:val="18"/>
+              </w:rPr>
+              <w:t>Technical and Vocational Education and Training</w:t>
+            </w:r>
+          </w:p>
+        </w:tc>
+      </w:tr>
+      <w:tr>
+        <w:tc>
+          <w:tcPr>
+            <w:tcW w:type="dxa" w:w="4703"/>
+            <w:shd w:val="clear" w:color="auto" w:fill="EEF3F9"/>
+          </w:tcPr>
+          <w:p>
+            <w:r>
+              <w:rPr>
+                <w:sz w:val="18"/>
+              </w:rPr>
+              <w:t>TWG</w:t>
+            </w:r>
+          </w:p>
+        </w:tc>
+        <w:tc>
+          <w:tcPr>
+            <w:tcW w:type="dxa" w:w="4703"/>
+            <w:shd w:val="clear" w:color="auto" w:fill="EEF3F9"/>
+          </w:tcPr>
+          <w:p>
+            <w:r>
+              <w:rPr>
+                <w:sz w:val="18"/>
+              </w:rPr>
+              <w:t>Technical Working Group</w:t>
+            </w:r>
+          </w:p>
+        </w:tc>
+      </w:tr>
+      <w:tr>
+        <w:tc>
+          <w:tcPr>
+            <w:tcW w:type="dxa" w:w="4703"/>
+            <w:shd w:val="clear" w:color="auto" w:fill="FFFFFF"/>
+          </w:tcPr>
+          <w:p>
+            <w:r>
+              <w:rPr>
+                <w:sz w:val="18"/>
+              </w:rPr>
+              <w:t>UAE</w:t>
+            </w:r>
+          </w:p>
+        </w:tc>
+        <w:tc>
+          <w:tcPr>
+            <w:tcW w:type="dxa" w:w="4703"/>
+            <w:shd w:val="clear" w:color="auto" w:fill="FFFFFF"/>
+          </w:tcPr>
+          <w:p>
+            <w:r>
+              <w:rPr>
+                <w:sz w:val="18"/>
+              </w:rPr>
+              <w:t>United Arab Emirates</w:t>
+            </w:r>
+          </w:p>
+        </w:tc>
+      </w:tr>
+      <w:tr>
+        <w:tc>
+          <w:tcPr>
+            <w:tcW w:type="dxa" w:w="4703"/>
+            <w:shd w:val="clear" w:color="auto" w:fill="EEF3F9"/>
+          </w:tcPr>
+          <w:p>
+            <w:r>
+              <w:rPr>
+                <w:sz w:val="18"/>
+              </w:rPr>
+              <w:t>UBOS</w:t>
+            </w:r>
+          </w:p>
+        </w:tc>
+        <w:tc>
+          <w:tcPr>
+            <w:tcW w:type="dxa" w:w="4703"/>
+            <w:shd w:val="clear" w:color="auto" w:fill="EEF3F9"/>
+          </w:tcPr>
+          <w:p>
+            <w:r>
+              <w:rPr>
+                <w:sz w:val="18"/>
+              </w:rPr>
+              <w:t>Uganda Bureau of Statistics</w:t>
+            </w:r>
+          </w:p>
+        </w:tc>
+      </w:tr>
+      <w:tr>
+        <w:tc>
+          <w:tcPr>
+            <w:tcW w:type="dxa" w:w="4703"/>
+            <w:shd w:val="clear" w:color="auto" w:fill="FFFFFF"/>
+          </w:tcPr>
+          <w:p>
+            <w:r>
+              <w:rPr>
+                <w:sz w:val="18"/>
+              </w:rPr>
+              <w:t>UDB</w:t>
+            </w:r>
+          </w:p>
+        </w:tc>
+        <w:tc>
+          <w:tcPr>
+            <w:tcW w:type="dxa" w:w="4703"/>
+            <w:shd w:val="clear" w:color="auto" w:fill="FFFFFF"/>
+          </w:tcPr>
+          <w:p>
+            <w:r>
+              <w:rPr>
+                <w:sz w:val="18"/>
+              </w:rPr>
+              <w:t>Uganda Development Bank</w:t>
+            </w:r>
+          </w:p>
+        </w:tc>
+      </w:tr>
+      <w:tr>
+        <w:tc>
+          <w:tcPr>
+            <w:tcW w:type="dxa" w:w="4703"/>
+            <w:shd w:val="clear" w:color="auto" w:fill="EEF3F9"/>
+          </w:tcPr>
+          <w:p>
+            <w:r>
+              <w:rPr>
+                <w:sz w:val="18"/>
+              </w:rPr>
+              <w:t>UDC</w:t>
+            </w:r>
+          </w:p>
+        </w:tc>
+        <w:tc>
+          <w:tcPr>
+            <w:tcW w:type="dxa" w:w="4703"/>
+            <w:shd w:val="clear" w:color="auto" w:fill="EEF3F9"/>
+          </w:tcPr>
+          <w:p>
+            <w:r>
+              <w:rPr>
+                <w:sz w:val="18"/>
+              </w:rPr>
+              <w:t>Uganda Development Corporation</w:t>
+            </w:r>
+          </w:p>
+        </w:tc>
+      </w:tr>
+      <w:tr>
+        <w:tc>
+          <w:tcPr>
+            <w:tcW w:type="dxa" w:w="4703"/>
+            <w:shd w:val="clear" w:color="auto" w:fill="FFFFFF"/>
+          </w:tcPr>
+          <w:p>
+            <w:r>
+              <w:rPr>
+                <w:sz w:val="18"/>
+              </w:rPr>
+              <w:t>UEDCL</w:t>
+            </w:r>
+          </w:p>
+        </w:tc>
+        <w:tc>
+          <w:tcPr>
+            <w:tcW w:type="dxa" w:w="4703"/>
+            <w:shd w:val="clear" w:color="auto" w:fill="FFFFFF"/>
+          </w:tcPr>
+          <w:p>
+            <w:r>
+              <w:rPr>
+                <w:sz w:val="18"/>
+              </w:rPr>
+              <w:t>Uganda Electricity Distribution Company Limited</w:t>
+            </w:r>
+          </w:p>
+        </w:tc>
+      </w:tr>
+      <w:tr>
+        <w:tc>
+          <w:tcPr>
+            <w:tcW w:type="dxa" w:w="4703"/>
+            <w:shd w:val="clear" w:color="auto" w:fill="EEF3F9"/>
+          </w:tcPr>
+          <w:p>
+            <w:r>
+              <w:rPr>
+                <w:sz w:val="18"/>
+              </w:rPr>
+              <w:t>UEPB</w:t>
+            </w:r>
+          </w:p>
+        </w:tc>
+        <w:tc>
+          <w:tcPr>
+            <w:tcW w:type="dxa" w:w="4703"/>
+            <w:shd w:val="clear" w:color="auto" w:fill="EEF3F9"/>
+          </w:tcPr>
+          <w:p>
+            <w:r>
+              <w:rPr>
+                <w:sz w:val="18"/>
+              </w:rPr>
+              <w:t>Uganda Export Promotion Board</w:t>
+            </w:r>
+          </w:p>
+        </w:tc>
+      </w:tr>
+      <w:tr>
+        <w:tc>
+          <w:tcPr>
+            <w:tcW w:type="dxa" w:w="4703"/>
+            <w:shd w:val="clear" w:color="auto" w:fill="FFFFFF"/>
+          </w:tcPr>
+          <w:p>
+            <w:r>
+              <w:rPr>
+                <w:sz w:val="18"/>
+              </w:rPr>
+              <w:t>UETCL</w:t>
+            </w:r>
+          </w:p>
+        </w:tc>
+        <w:tc>
+          <w:tcPr>
+            <w:tcW w:type="dxa" w:w="4703"/>
+            <w:shd w:val="clear" w:color="auto" w:fill="FFFFFF"/>
+          </w:tcPr>
+          <w:p>
+            <w:r>
+              <w:rPr>
+                <w:sz w:val="18"/>
+              </w:rPr>
+              <w:t>Uganda Electricity Transmission Company Limited</w:t>
+            </w:r>
+          </w:p>
+        </w:tc>
+      </w:tr>
+      <w:tr>
+        <w:tc>
+          <w:tcPr>
+            <w:tcW w:type="dxa" w:w="4703"/>
+            <w:shd w:val="clear" w:color="auto" w:fill="EEF3F9"/>
+          </w:tcPr>
+          <w:p>
+            <w:r>
+              <w:rPr>
+                <w:sz w:val="18"/>
+              </w:rPr>
+              <w:t>UIA</w:t>
+            </w:r>
+          </w:p>
+        </w:tc>
+        <w:tc>
+          <w:tcPr>
+            <w:tcW w:type="dxa" w:w="4703"/>
+            <w:shd w:val="clear" w:color="auto" w:fill="EEF3F9"/>
+          </w:tcPr>
+          <w:p>
+            <w:r>
+              <w:rPr>
+                <w:sz w:val="18"/>
+              </w:rPr>
+              <w:t>Uganda Investment Authority</w:t>
+            </w:r>
+          </w:p>
+        </w:tc>
+      </w:tr>
+      <w:tr>
+        <w:tc>
+          <w:tcPr>
+            <w:tcW w:type="dxa" w:w="4703"/>
+            <w:shd w:val="clear" w:color="auto" w:fill="FFFFFF"/>
+          </w:tcPr>
+          <w:p>
+            <w:r>
+              <w:rPr>
+                <w:sz w:val="18"/>
+              </w:rPr>
+              <w:t>UIRI</w:t>
+            </w:r>
+          </w:p>
+        </w:tc>
+        <w:tc>
+          <w:tcPr>
+            <w:tcW w:type="dxa" w:w="4703"/>
+            <w:shd w:val="clear" w:color="auto" w:fill="FFFFFF"/>
+          </w:tcPr>
+          <w:p>
+            <w:r>
+              <w:rPr>
+                <w:sz w:val="18"/>
+              </w:rPr>
+              <w:t>Uganda Industrial Research Institute</w:t>
+            </w:r>
+          </w:p>
+        </w:tc>
+      </w:tr>
+      <w:tr>
+        <w:tc>
+          <w:tcPr>
+            <w:tcW w:type="dxa" w:w="4703"/>
+            <w:shd w:val="clear" w:color="auto" w:fill="EEF3F9"/>
+          </w:tcPr>
+          <w:p>
+            <w:r>
+              <w:rPr>
+                <w:sz w:val="18"/>
+              </w:rPr>
+              <w:t>UMA</w:t>
+            </w:r>
+          </w:p>
+        </w:tc>
+        <w:tc>
+          <w:tcPr>
+            <w:tcW w:type="dxa" w:w="4703"/>
+            <w:shd w:val="clear" w:color="auto" w:fill="EEF3F9"/>
+          </w:tcPr>
+          <w:p>
+            <w:r>
+              <w:rPr>
+                <w:sz w:val="18"/>
+              </w:rPr>
+              <w:t>Uganda Manufacturers Association</w:t>
+            </w:r>
+          </w:p>
+        </w:tc>
+      </w:tr>
+      <w:tr>
+        <w:tc>
+          <w:tcPr>
+            <w:tcW w:type="dxa" w:w="4703"/>
+            <w:shd w:val="clear" w:color="auto" w:fill="FFFFFF"/>
+          </w:tcPr>
+          <w:p>
+            <w:r>
+              <w:rPr>
+                <w:sz w:val="18"/>
+              </w:rPr>
+              <w:t>Umeme</w:t>
+            </w:r>
+          </w:p>
+        </w:tc>
+        <w:tc>
+          <w:tcPr>
+            <w:tcW w:type="dxa" w:w="4703"/>
+            <w:shd w:val="clear" w:color="auto" w:fill="FFFFFF"/>
+          </w:tcPr>
+          <w:p>
+            <w:r>
+              <w:rPr>
+                <w:sz w:val="18"/>
+              </w:rPr>
+              <w:t>Umeme Limited (national electricity distributor)</w:t>
+            </w:r>
+          </w:p>
+        </w:tc>
+      </w:tr>
+      <w:tr>
+        <w:tc>
+          <w:tcPr>
+            <w:tcW w:type="dxa" w:w="4703"/>
+            <w:shd w:val="clear" w:color="auto" w:fill="EEF3F9"/>
+          </w:tcPr>
+          <w:p>
+            <w:r>
+              <w:rPr>
+                <w:sz w:val="18"/>
+              </w:rPr>
+              <w:t>UNBS</w:t>
+            </w:r>
+          </w:p>
+        </w:tc>
+        <w:tc>
+          <w:tcPr>
+            <w:tcW w:type="dxa" w:w="4703"/>
+            <w:shd w:val="clear" w:color="auto" w:fill="EEF3F9"/>
+          </w:tcPr>
+          <w:p>
+            <w:r>
+              <w:rPr>
+                <w:sz w:val="18"/>
+              </w:rPr>
+              <w:t>Uganda National Bureau of Standards</w:t>
+            </w:r>
+          </w:p>
+        </w:tc>
+      </w:tr>
+      <w:tr>
+        <w:tc>
+          <w:tcPr>
+            <w:tcW w:type="dxa" w:w="4703"/>
+            <w:shd w:val="clear" w:color="auto" w:fill="FFFFFF"/>
+          </w:tcPr>
+          <w:p>
+            <w:r>
+              <w:rPr>
+                <w:sz w:val="18"/>
+              </w:rPr>
+              <w:t>UNIDO</w:t>
+            </w:r>
+          </w:p>
+        </w:tc>
+        <w:tc>
+          <w:tcPr>
+            <w:tcW w:type="dxa" w:w="4703"/>
+            <w:shd w:val="clear" w:color="auto" w:fill="FFFFFF"/>
+          </w:tcPr>
+          <w:p>
+            <w:r>
+              <w:rPr>
+                <w:sz w:val="18"/>
+              </w:rPr>
+              <w:t>United Nations Industrial Development Organization</w:t>
+            </w:r>
+          </w:p>
+        </w:tc>
+      </w:tr>
+      <w:tr>
+        <w:tc>
+          <w:tcPr>
+            <w:tcW w:type="dxa" w:w="4703"/>
+            <w:shd w:val="clear" w:color="auto" w:fill="EEF3F9"/>
+          </w:tcPr>
+          <w:p>
+            <w:r>
+              <w:rPr>
+                <w:sz w:val="18"/>
+              </w:rPr>
+              <w:t>UNMC</w:t>
+            </w:r>
+          </w:p>
+        </w:tc>
+        <w:tc>
+          <w:tcPr>
+            <w:tcW w:type="dxa" w:w="4703"/>
+            <w:shd w:val="clear" w:color="auto" w:fill="EEF3F9"/>
+          </w:tcPr>
+          <w:p>
+            <w:r>
+              <w:rPr>
+                <w:sz w:val="18"/>
+              </w:rPr>
+              <w:t>Uganda National Mining Company</w:t>
+            </w:r>
+          </w:p>
+        </w:tc>
+      </w:tr>
+      <w:tr>
+        <w:tc>
+          <w:tcPr>
+            <w:tcW w:type="dxa" w:w="4703"/>
+            <w:shd w:val="clear" w:color="auto" w:fill="FFFFFF"/>
+          </w:tcPr>
+          <w:p>
+            <w:r>
+              <w:rPr>
+                <w:sz w:val="18"/>
+              </w:rPr>
+              <w:t>UNRA</w:t>
+            </w:r>
+          </w:p>
+        </w:tc>
+        <w:tc>
+          <w:tcPr>
+            <w:tcW w:type="dxa" w:w="4703"/>
+            <w:shd w:val="clear" w:color="auto" w:fill="FFFFFF"/>
+          </w:tcPr>
+          <w:p>
+            <w:r>
+              <w:rPr>
+                <w:sz w:val="18"/>
+              </w:rPr>
+              <w:t>Uganda National Roads Authority</w:t>
+            </w:r>
+          </w:p>
+        </w:tc>
+      </w:tr>
+      <w:tr>
+        <w:tc>
+          <w:tcPr>
+            <w:tcW w:type="dxa" w:w="4703"/>
+            <w:shd w:val="clear" w:color="auto" w:fill="EEF3F9"/>
+          </w:tcPr>
+          <w:p>
+            <w:r>
+              <w:rPr>
+                <w:sz w:val="18"/>
+              </w:rPr>
+              <w:t>URA</w:t>
+            </w:r>
+          </w:p>
+        </w:tc>
+        <w:tc>
+          <w:tcPr>
+            <w:tcW w:type="dxa" w:w="4703"/>
+            <w:shd w:val="clear" w:color="auto" w:fill="EEF3F9"/>
+          </w:tcPr>
+          <w:p>
+            <w:r>
+              <w:rPr>
+                <w:sz w:val="18"/>
+              </w:rPr>
+              <w:t>Uganda Revenue Authority</w:t>
+            </w:r>
+          </w:p>
+        </w:tc>
+      </w:tr>
+      <w:tr>
+        <w:tc>
+          <w:tcPr>
+            <w:tcW w:type="dxa" w:w="4703"/>
+            <w:shd w:val="clear" w:color="auto" w:fill="FFFFFF"/>
+          </w:tcPr>
+          <w:p>
+            <w:r>
+              <w:rPr>
+                <w:sz w:val="18"/>
+              </w:rPr>
+              <w:t>UGX</w:t>
+            </w:r>
+          </w:p>
+        </w:tc>
+        <w:tc>
+          <w:tcPr>
+            <w:tcW w:type="dxa" w:w="4703"/>
+            <w:shd w:val="clear" w:color="auto" w:fill="FFFFFF"/>
+          </w:tcPr>
+          <w:p>
+            <w:r>
+              <w:rPr>
+                <w:sz w:val="18"/>
+              </w:rPr>
+              <w:t>Uganda Shilling</w:t>
+            </w:r>
+          </w:p>
+        </w:tc>
+      </w:tr>
+      <w:tr>
+        <w:tc>
+          <w:tcPr>
+            <w:tcW w:type="dxa" w:w="4703"/>
+            <w:shd w:val="clear" w:color="auto" w:fill="EEF3F9"/>
+          </w:tcPr>
+          <w:p>
+            <w:r>
+              <w:rPr>
+                <w:sz w:val="18"/>
+              </w:rPr>
+              <w:t>USD</w:t>
+            </w:r>
+          </w:p>
+        </w:tc>
+        <w:tc>
+          <w:tcPr>
+            <w:tcW w:type="dxa" w:w="4703"/>
+            <w:shd w:val="clear" w:color="auto" w:fill="EEF3F9"/>
+          </w:tcPr>
+          <w:p>
+            <w:r>
+              <w:rPr>
+                <w:sz w:val="18"/>
+              </w:rPr>
+              <w:t>United States Dollar</w:t>
+            </w:r>
+          </w:p>
+        </w:tc>
+      </w:tr>
+      <w:tr>
+        <w:tc>
+          <w:tcPr>
+            <w:tcW w:type="dxa" w:w="4703"/>
+            <w:shd w:val="clear" w:color="auto" w:fill="FFFFFF"/>
+          </w:tcPr>
+          <w:p>
+            <w:r>
+              <w:rPr>
+                <w:sz w:val="18"/>
+              </w:rPr>
+              <w:t>VTI</w:t>
+            </w:r>
+          </w:p>
+        </w:tc>
+        <w:tc>
+          <w:tcPr>
+            <w:tcW w:type="dxa" w:w="4703"/>
+            <w:shd w:val="clear" w:color="auto" w:fill="FFFFFF"/>
+          </w:tcPr>
+          <w:p>
+            <w:r>
+              <w:rPr>
+                <w:sz w:val="18"/>
+              </w:rPr>
+              <w:t>Vocational Training Institute</w:t>
+            </w:r>
+          </w:p>
+        </w:tc>
+      </w:tr>
+      <w:tr>
+        <w:tc>
+          <w:tcPr>
+            <w:tcW w:type="dxa" w:w="4703"/>
+            <w:shd w:val="clear" w:color="auto" w:fill="EEF3F9"/>
+          </w:tcPr>
+          <w:p>
+            <w:r>
+              <w:rPr>
+                <w:sz w:val="18"/>
+              </w:rPr>
+              <w:t>WDI</w:t>
+            </w:r>
+          </w:p>
+        </w:tc>
+        <w:tc>
+          <w:tcPr>
+            <w:tcW w:type="dxa" w:w="4703"/>
+            <w:shd w:val="clear" w:color="auto" w:fill="EEF3F9"/>
+          </w:tcPr>
+          <w:p>
+            <w:r>
+              <w:rPr>
+                <w:sz w:val="18"/>
+              </w:rPr>
+              <w:t>World Development Indicators (World Bank)</w:t>
+            </w:r>
+          </w:p>
+        </w:tc>
+      </w:tr>
+      <w:tr>
+        <w:tc>
+          <w:tcPr>
+            <w:tcW w:type="dxa" w:w="4703"/>
+            <w:shd w:val="clear" w:color="auto" w:fill="FFFFFF"/>
+          </w:tcPr>
+          <w:p>
+            <w:r>
+              <w:rPr>
+                <w:sz w:val="18"/>
+              </w:rPr>
+              <w:t>WTO</w:t>
+            </w:r>
+          </w:p>
+        </w:tc>
+        <w:tc>
+          <w:tcPr>
+            <w:tcW w:type="dxa" w:w="4703"/>
+            <w:shd w:val="clear" w:color="auto" w:fill="FFFFFF"/>
+          </w:tcPr>
+          <w:p>
+            <w:r>
+              <w:rPr>
+                <w:sz w:val="18"/>
+              </w:rPr>
+              <w:t>World Trade Organization</w:t>
+            </w:r>
+          </w:p>
+        </w:tc>
+      </w:tr>
+    </w:tbl>
+    <w:p/>
+    <w:p>
+      <w:r>
+        <w:br w:type="page"/>
+      </w:r>
+    </w:p>
+    <w:p>
+      <w:pPr>
+        <w:pStyle w:val="Heading1"/>
+      </w:pPr>
+      <w:r>
         <w:t>Chapter 1: Executive Summary</w:t>
       </w:r>
     </w:p>
@@ -186,7 +2231,7 @@
         <w:t>desk-based diagnostic, offered for validation</w:t>
       </w:r>
       <w:r>
-        <w:t xml:space="preserve"> through key informant interviews and a stakeholder workshop (see Chapter 3). All trade figures are drawn from ITC TradeMap (2024) and cited at the point of use.</w:t>
+        <w:t xml:space="preserve"> through key informant interviews and a stakeholder workshop (see Chapter 3). All trade figures are drawn from International Trade Centre (ITC) TradeMap (2024) and cited at the point of use.</w:t>
       </w:r>
     </w:p>
     <w:p>
@@ -241,7 +2286,7 @@
         <w:rPr>
           <w:b/>
         </w:rPr>
-        <w:t>15.2% of GDP (2024)</w:t>
+        <w:t>15.2% of Gross Domestic Product (GDP) (2024)</w:t>
       </w:r>
       <w:r>
         <w:t xml:space="preserve"> — below even the National Industrial Policy's own 2029/30 target of ~16% — at roughly 30% capacity utilization (World Bank; NIP 2020). Across all three Report 1 chains, the same pattern recurs: </w:t>
@@ -273,10 +2318,10 @@
         <w:rPr>
           <w:b/>
         </w:rPr>
-        <w:t>USD 55.8m of rebar</w:t>
-      </w:r>
-      <w:r>
-        <w:t xml:space="preserve"> in 2024, mostly to South Sudan and the DRC — but imports </w:t>
+        <w:t>United States Dollar (USD) 55.8m of rebar</w:t>
+      </w:r>
+      <w:r>
+        <w:t xml:space="preserve"> in 2024, mostly to South Sudan and the Democratic Republic of Congo (DRC) — but imports </w:t>
       </w:r>
       <w:r>
         <w:rPr>
@@ -791,7 +2836,7 @@
         <w:rPr>
           <w:b/>
         </w:rPr>
-        <w:t>ToR Reference:</w:t>
+        <w:t>Terms of Reference (ToR) Reference:</w:t>
       </w:r>
       <w:r>
         <w:t xml:space="preserve"> MTIC-Diagnostic Study on Iron &amp; Steel, Copper.docx</w:t>
@@ -1181,7 +3226,7 @@
         <w:t>Iron &amp; Steel</w:t>
       </w:r>
       <w:r>
-        <w:t xml:space="preserve"> was selected because Uganda holds substantial iron-ore deposits (notably high-grade hematite and magnetite in the south-west and Muko area), while importing the bulk of its flat steel and semi-finished steel. The NPA/UDC </w:t>
+        <w:t xml:space="preserve"> was selected because Uganda holds substantial iron-ore deposits (notably high-grade hematite and magnetite in the south-west and Muko area), while importing the bulk of its flat steel and semi-finished steel. The National Planning Authority (NPA)/UDC </w:t>
       </w:r>
       <w:r>
         <w:rPr>
@@ -2130,7 +4175,7 @@
         <w:t>Development-partner and industry sources</w:t>
       </w:r>
       <w:r>
-        <w:t xml:space="preserve"> — World Bank World Development Indicators; UNIDO; the Uganda Bankers Association </w:t>
+        <w:t xml:space="preserve"> — World Bank World Development Indicators; United Nations Industrial Development Organization (UNIDO); the Uganda Bankers Association </w:t>
       </w:r>
       <w:r>
         <w:rPr>
@@ -2433,7 +4478,7 @@
               <w:rPr>
                 <w:sz w:val="18"/>
               </w:rPr>
-              <w:t>ERA tariffs 2025; UEDCL</w:t>
+              <w:t>ERA tariffs 2025; Uganda Electricity Distribution Company Limited (UEDCL)</w:t>
             </w:r>
           </w:p>
         </w:tc>
@@ -2477,7 +4522,7 @@
               <w:rPr>
                 <w:sz w:val="18"/>
               </w:rPr>
-              <w:t>NWSC; NEMA framework</w:t>
+              <w:t>National Water and Sewerage Corporation (NWSC); National Environment Management Authority (NEMA) framework</w:t>
             </w:r>
           </w:p>
         </w:tc>
@@ -2609,7 +4654,7 @@
               <w:rPr>
                 <w:sz w:val="18"/>
               </w:rPr>
-              <w:t>KPMG Budget Brief 2025/26; UDB</w:t>
+              <w:t>KPMG Budget Brief 2025/26; Uganda Development Bank (UDB)</w:t>
             </w:r>
           </w:p>
         </w:tc>
@@ -2727,7 +4772,7 @@
               <w:rPr>
                 <w:sz w:val="18"/>
               </w:rPr>
-              <w:t>Tariffs, NTBs, licensing, land, incentives</w:t>
+              <w:t>Tariffs, Non-Tariff Barriers (NTBs), licensing, land, incentives</w:t>
             </w:r>
           </w:p>
         </w:tc>
@@ -2741,7 +4786,7 @@
               <w:rPr>
                 <w:sz w:val="18"/>
               </w:rPr>
-              <w:t>NIP 2020; sector Acts; EAC CET</w:t>
+              <w:t>NIP 2020; sector Acts; East African Community (EAC) Common External Tariff (CET)</w:t>
             </w:r>
           </w:p>
         </w:tc>
@@ -4365,7 +6410,7 @@
               <w:rPr>
                 <w:sz w:val="18"/>
               </w:rPr>
-              <w:t>~1,850 permanent employees (2021); two integrated entities</w:t>
+              <w:t>~1,850 permanent employees (2021); two integrated entities (African Business, 2021)</w:t>
             </w:r>
           </w:p>
         </w:tc>
@@ -5259,7 +7304,7 @@
               <w:rPr>
                 <w:sz w:val="18"/>
               </w:rPr>
-              <w:t>Landlocked-cost penalty is severe: national logistics inefficiency costs the economy ~USD 827m/yr and logistics is ~18–20% of the sale price of goods — heavy for a bulk, low-value-density product like steel.</w:t>
+              <w:t>Landlocked-cost penalty is severe: national logistics inefficiency costs the economy ~USD 827m/yr and logistics is ~18–20% of the sale price of goods (sector estimates) — heavy for a bulk, low-value-density product like steel.</w:t>
             </w:r>
           </w:p>
         </w:tc>
@@ -5352,7 +7397,7 @@
               <w:rPr>
                 <w:sz w:val="18"/>
               </w:rPr>
-              <w:t>Shortage of metallurgical and process-engineering skills; ~68% of manufacturers report difficulty finding required technical skills (UMA).</w:t>
+              <w:t>Shortage of metallurgical and process-engineering skills; ~68% of manufacturers report difficulty finding required technical skills (Uganda Manufacturers Association, UMA).</w:t>
             </w:r>
           </w:p>
         </w:tc>
@@ -6491,7 +8536,7 @@
               <w:rPr>
                 <w:sz w:val="18"/>
               </w:rPr>
-              <w:t>UNBS, MTIC, URA</w:t>
+              <w:t>UNBS, MTIC, Uganda Revenue Authority (URA)</w:t>
             </w:r>
           </w:p>
         </w:tc>
@@ -6549,7 +8594,7 @@
               <w:rPr>
                 <w:sz w:val="18"/>
               </w:rPr>
-              <w:t>MEMD, MoFPED</w:t>
+              <w:t>Ministry of Energy and Mineral Development (MEMD), Ministry of Finance, Planning and Economic Development (MoFPED)</w:t>
             </w:r>
           </w:p>
         </w:tc>
@@ -6710,7 +8755,7 @@
               <w:rPr>
                 <w:sz w:val="18"/>
               </w:rPr>
-              <w:t>Skills programme in metallurgy/process engineering with UIRI, Makerere, TVET</w:t>
+              <w:t>Skills programme in metallurgy/process engineering with Uganda Industrial Research Institute (UIRI), Makerere, Technical and Vocational Education and Training (TVET)</w:t>
             </w:r>
           </w:p>
         </w:tc>
@@ -6724,7 +8769,7 @@
               <w:rPr>
                 <w:sz w:val="18"/>
               </w:rPr>
-              <w:t>MoES, UIRI</w:t>
+              <w:t>Ministry of Education and Sports (MoES), UIRI</w:t>
             </w:r>
           </w:p>
         </w:tc>
@@ -6968,6 +9013,14 @@
       </w:pPr>
       <w:r>
         <w:t>Electricity Regulatory Authority, end-user tariffs 2025. https://www.era.go.ug/</w:t>
+      </w:r>
+    </w:p>
+    <w:p>
+      <w:pPr>
+        <w:pStyle w:val="ListBullet"/>
+      </w:pPr>
+      <w:r>
+        <w:t>Uganda Manufacturers Association (UMA), skills and manufacturing survey evidence. https://www.uma.or.ug/</w:t>
       </w:r>
     </w:p>
     <w:p>
@@ -9514,7 +11567,7 @@
               <w:rPr>
                 <w:sz w:val="18"/>
               </w:rPr>
-              <w:t>ERA, UNRA, MEMD</w:t>
+              <w:t>ERA, Uganda National Roads Authority (UNRA), MEMD</w:t>
             </w:r>
           </w:p>
         </w:tc>
@@ -10875,7 +12928,7 @@
               <w:rPr>
                 <w:sz w:val="18"/>
               </w:rPr>
-              <w:t>KMC brings modern assembly technology; component manufacture and tooling remain shallow. EV capability (Kayoola) is a genuine differentiator.</w:t>
+              <w:t>KMC brings modern assembly technology; component manufacture and tooling remain shallow. Electric Vehicle (EV) capability (Kayoola) is a genuine differentiator.</w:t>
             </w:r>
           </w:p>
         </w:tc>
@@ -11030,7 +13083,7 @@
               <w:rPr>
                 <w:sz w:val="18"/>
               </w:rPr>
-              <w:t>The binding constraint for scale-up: KMC's ~UGX 50bn FY25/26 gap; long-term capital for tooling and working capital is scarce.</w:t>
+              <w:t>The binding constraint for scale-up: KMC's ~Uganda Shilling (UGX) 50bn FY25/26 gap; long-term capital for tooling and working capital is scarce.</w:t>
             </w:r>
           </w:p>
         </w:tc>
@@ -11061,7 +13114,7 @@
               <w:rPr>
                 <w:sz w:val="18"/>
               </w:rPr>
-              <w:t>Automotive/mechatronics and EV skills are scarce; KMC and Makerere/Nakawa VTI partnerships are building them.</w:t>
+              <w:t>Automotive/mechatronics and EV skills are scarce; KMC and Makerere/Nakawa Vocational Training Institute (VTI) partnerships are building them.</w:t>
             </w:r>
           </w:p>
         </w:tc>
@@ -11092,7 +13145,7 @@
               <w:rPr>
                 <w:sz w:val="18"/>
               </w:rPr>
-              <w:t>Vehicle standards, homologation, and used-import age limits shape the market; UNBS and MWT regulation matter.</w:t>
+              <w:t>Vehicle standards, homologation, and used-import age limits shape the market; UNBS and Ministry of Works and Transport (MoWT) regulation matter.</w:t>
             </w:r>
           </w:p>
         </w:tc>
@@ -13063,7 +15116,7 @@
               <w:rPr>
                 <w:sz w:val="18"/>
               </w:rPr>
-              <w:t>Slag/tailings reuse; EV manufacturing (KMC); scrap-based EAF steel</w:t>
+              <w:t>Slag/tailings reuse; EV manufacturing (KMC); scrap-based Electric Arc Furnace (EAF) steel</w:t>
             </w:r>
           </w:p>
         </w:tc>
@@ -14725,7 +16778,7 @@
               <w:rPr>
                 <w:sz w:val="18"/>
               </w:rPr>
-              <w:t>Power agreement; beneficiation start; flat-mill FEED</w:t>
+              <w:t>Power agreement; beneficiation start; flat-mill Front-End Engineering Design (FEED)</w:t>
             </w:r>
           </w:p>
         </w:tc>

</xml_diff>

<commit_message>
Rebuild Word drafts: cross-cutting, investment, and status-report annexes
Co-Authored-By: Claude Opus 4.8 <noreply@anthropic.com>
</commit_message>
<xml_diff>
--- a/report/Report-1-Iron-Steel-Copper-Automotive.docx
+++ b/report/Report-1-Iron-Steel-Copper-Automotive.docx
@@ -20894,7 +20894,7 @@
     </w:p>
     <w:p>
       <w:r>
-        <w:t xml:space="preserve">The integrating insight of Report 1 is that </w:t>
+        <w:t xml:space="preserve">The integrating insight of this report is that </w:t>
       </w:r>
       <w:r>
         <w:rPr>
@@ -20904,6 +20904,17 @@
       </w:r>
       <w:r>
         <w:t>: mined and processed metal feeds fabricated products that feed vehicle manufacture. Constraints that raise the cost of metal — energy, logistics, finance, feedstock policy — cascade through all three. Addressing them once benefits the whole system.</w:t>
+      </w:r>
+    </w:p>
+    <w:p>
+      <w:r>
+        <w:rPr>
+          <w:b/>
+        </w:rPr>
+        <w:t>Tenfold framing.</w:t>
+      </w:r>
+      <w:r>
+        <w:t xml:space="preserve"> These cross-cutting actions are the enablers of the Tenfold Growth Strategy in the metals-to-mobility system: a ten-times-larger economy needs domestically-processed metal, reliable industrial power, long-term capital, and skills at a scale that no single chain can unlock alone. Fixing the shared constraints is therefore the highest-leverage investment toward tenfold growth — it multiplies the return on every chain-specific action in Chapters 4–6.</w:t>
       </w:r>
     </w:p>
     <w:p>
@@ -20916,7 +20927,473 @@
     </w:p>
     <w:p>
       <w:r>
-        <w:t>Across the three chains, five constraints recur as decisive (drawing on the chain analyses and on cross-cutting evidence):</w:t>
+        <w:t>Across the three chains, five constraints recur as decisive. Weighted by how critical each is to unlocking the system (1 = low, 5 = critical), drawing on the chain analyses and NPA/UDC regional-competitiveness data:</w:t>
+      </w:r>
+    </w:p>
+    <w:tbl>
+      <w:tblPr>
+        <w:tblStyle w:val="TableGrid"/>
+        <w:tblW w:type="auto" w:w="0"/>
+        <w:jc w:val="left"/>
+        <w:tblLook w:firstColumn="1" w:firstRow="1" w:lastColumn="0" w:lastRow="0" w:noHBand="0" w:noVBand="1" w:val="04A0"/>
+      </w:tblPr>
+      <w:tblGrid>
+        <w:gridCol w:w="2351"/>
+        <w:gridCol w:w="2351"/>
+        <w:gridCol w:w="2351"/>
+        <w:gridCol w:w="2351"/>
+      </w:tblGrid>
+      <w:tr>
+        <w:tc>
+          <w:tcPr>
+            <w:tcW w:type="dxa" w:w="2351"/>
+            <w:shd w:val="clear" w:color="auto" w:fill="002B5B"/>
+          </w:tcPr>
+          <w:p>
+            <w:r>
+              <w:rPr>
+                <w:b/>
+                <w:color w:val="FFFFFF"/>
+                <w:sz w:val="18"/>
+              </w:rPr>
+              <w:t>Rank</w:t>
+            </w:r>
+          </w:p>
+        </w:tc>
+        <w:tc>
+          <w:tcPr>
+            <w:tcW w:type="dxa" w:w="2351"/>
+            <w:shd w:val="clear" w:color="auto" w:fill="002B5B"/>
+          </w:tcPr>
+          <w:p>
+            <w:r>
+              <w:rPr>
+                <w:b/>
+                <w:color w:val="FFFFFF"/>
+                <w:sz w:val="18"/>
+              </w:rPr>
+              <w:t>Cross-cutting constraint</w:t>
+            </w:r>
+          </w:p>
+        </w:tc>
+        <w:tc>
+          <w:tcPr>
+            <w:tcW w:type="dxa" w:w="2351"/>
+            <w:shd w:val="clear" w:color="auto" w:fill="002B5B"/>
+          </w:tcPr>
+          <w:p>
+            <w:r>
+              <w:rPr>
+                <w:b/>
+                <w:color w:val="FFFFFF"/>
+                <w:sz w:val="18"/>
+              </w:rPr>
+              <w:t>Weight</w:t>
+            </w:r>
+          </w:p>
+        </w:tc>
+        <w:tc>
+          <w:tcPr>
+            <w:tcW w:type="dxa" w:w="2351"/>
+            <w:shd w:val="clear" w:color="auto" w:fill="002B5B"/>
+          </w:tcPr>
+          <w:p>
+            <w:r>
+              <w:rPr>
+                <w:b/>
+                <w:color w:val="FFFFFF"/>
+                <w:sz w:val="18"/>
+              </w:rPr>
+              <w:t>Hard evidence</w:t>
+            </w:r>
+          </w:p>
+        </w:tc>
+      </w:tr>
+      <w:tr>
+        <w:tc>
+          <w:tcPr>
+            <w:tcW w:type="dxa" w:w="2351"/>
+            <w:shd w:val="clear" w:color="auto" w:fill="EEF3F9"/>
+          </w:tcPr>
+          <w:p>
+            <w:r>
+              <w:rPr>
+                <w:sz w:val="18"/>
+              </w:rPr>
+              <w:t>1</w:t>
+            </w:r>
+          </w:p>
+        </w:tc>
+        <w:tc>
+          <w:tcPr>
+            <w:tcW w:type="dxa" w:w="2351"/>
+            <w:shd w:val="clear" w:color="auto" w:fill="EEF3F9"/>
+          </w:tcPr>
+          <w:p>
+            <w:r>
+              <w:rPr>
+                <w:sz w:val="18"/>
+              </w:rPr>
+              <w:t>Feedstock leakage / upstream gap</w:t>
+            </w:r>
+          </w:p>
+        </w:tc>
+        <w:tc>
+          <w:tcPr>
+            <w:tcW w:type="dxa" w:w="2351"/>
+            <w:shd w:val="clear" w:color="auto" w:fill="EEF3F9"/>
+          </w:tcPr>
+          <w:p>
+            <w:r>
+              <w:rPr>
+                <w:b/>
+                <w:sz w:val="18"/>
+              </w:rPr>
+              <w:t>5</w:t>
+            </w:r>
+          </w:p>
+        </w:tc>
+        <w:tc>
+          <w:tcPr>
+            <w:tcW w:type="dxa" w:w="2351"/>
+            <w:shd w:val="clear" w:color="auto" w:fill="EEF3F9"/>
+          </w:tcPr>
+          <w:p>
+            <w:r>
+              <w:rPr>
+                <w:sz w:val="18"/>
+              </w:rPr>
+              <w:t>Iron ore exported raw (USD 35.8m); copper ore unmined; metal re-imported — billet/scrap most-expensive route (~USD 676/t)</w:t>
+            </w:r>
+          </w:p>
+        </w:tc>
+      </w:tr>
+      <w:tr>
+        <w:tc>
+          <w:tcPr>
+            <w:tcW w:type="dxa" w:w="2351"/>
+            <w:shd w:val="clear" w:color="auto" w:fill="FFFFFF"/>
+          </w:tcPr>
+          <w:p>
+            <w:r>
+              <w:rPr>
+                <w:sz w:val="18"/>
+              </w:rPr>
+              <w:t>2</w:t>
+            </w:r>
+          </w:p>
+        </w:tc>
+        <w:tc>
+          <w:tcPr>
+            <w:tcW w:type="dxa" w:w="2351"/>
+            <w:shd w:val="clear" w:color="auto" w:fill="FFFFFF"/>
+          </w:tcPr>
+          <w:p>
+            <w:r>
+              <w:rPr>
+                <w:sz w:val="18"/>
+              </w:rPr>
+              <w:t>Access to long-term finance</w:t>
+            </w:r>
+          </w:p>
+        </w:tc>
+        <w:tc>
+          <w:tcPr>
+            <w:tcW w:type="dxa" w:w="2351"/>
+            <w:shd w:val="clear" w:color="auto" w:fill="FFFFFF"/>
+          </w:tcPr>
+          <w:p>
+            <w:r>
+              <w:rPr>
+                <w:b/>
+                <w:sz w:val="18"/>
+              </w:rPr>
+              <w:t>5</w:t>
+            </w:r>
+          </w:p>
+        </w:tc>
+        <w:tc>
+          <w:tcPr>
+            <w:tcW w:type="dxa" w:w="2351"/>
+            <w:shd w:val="clear" w:color="auto" w:fill="FFFFFF"/>
+          </w:tcPr>
+          <w:p>
+            <w:r>
+              <w:rPr>
+                <w:sz w:val="18"/>
+              </w:rPr>
+              <w:t xml:space="preserve">Uganda commercial interest </w:t>
+            </w:r>
+            <w:r>
+              <w:rPr>
+                <w:b/>
+                <w:sz w:val="18"/>
+              </w:rPr>
+              <w:t>18–23% — highest in region</w:t>
+            </w:r>
+            <w:r>
+              <w:rPr>
+                <w:sz w:val="18"/>
+              </w:rPr>
+              <w:t xml:space="preserve"> (Kenya 13–17, Egypt 10–12); 2025 liquidity tightening crowds out private credit</w:t>
+            </w:r>
+          </w:p>
+        </w:tc>
+      </w:tr>
+      <w:tr>
+        <w:tc>
+          <w:tcPr>
+            <w:tcW w:type="dxa" w:w="2351"/>
+            <w:shd w:val="clear" w:color="auto" w:fill="EEF3F9"/>
+          </w:tcPr>
+          <w:p>
+            <w:r>
+              <w:rPr>
+                <w:sz w:val="18"/>
+              </w:rPr>
+              <w:t>3</w:t>
+            </w:r>
+          </w:p>
+        </w:tc>
+        <w:tc>
+          <w:tcPr>
+            <w:tcW w:type="dxa" w:w="2351"/>
+            <w:shd w:val="clear" w:color="auto" w:fill="EEF3F9"/>
+          </w:tcPr>
+          <w:p>
+            <w:r>
+              <w:rPr>
+                <w:sz w:val="18"/>
+              </w:rPr>
+              <w:t>Energy cost &amp; reliability</w:t>
+            </w:r>
+          </w:p>
+        </w:tc>
+        <w:tc>
+          <w:tcPr>
+            <w:tcW w:type="dxa" w:w="2351"/>
+            <w:shd w:val="clear" w:color="auto" w:fill="EEF3F9"/>
+          </w:tcPr>
+          <w:p>
+            <w:r>
+              <w:rPr>
+                <w:b/>
+                <w:sz w:val="18"/>
+              </w:rPr>
+              <w:t>4</w:t>
+            </w:r>
+          </w:p>
+        </w:tc>
+        <w:tc>
+          <w:tcPr>
+            <w:tcW w:type="dxa" w:w="2351"/>
+            <w:shd w:val="clear" w:color="auto" w:fill="EEF3F9"/>
+          </w:tcPr>
+          <w:p>
+            <w:r>
+              <w:rPr>
+                <w:sz w:val="18"/>
+              </w:rPr>
+              <w:t xml:space="preserve">Effective industrial tariff </w:t>
+            </w:r>
+            <w:r>
+              <w:rPr>
+                <w:b/>
+                <w:sz w:val="18"/>
+              </w:rPr>
+              <w:t>~8–10 US¢/kWh vs Kenya 5–7, Egypt 4–5</w:t>
+            </w:r>
+            <w:r>
+              <w:rPr>
+                <w:sz w:val="18"/>
+              </w:rPr>
+              <w:t>; reliability the #1 firm-cited issue</w:t>
+            </w:r>
+          </w:p>
+        </w:tc>
+      </w:tr>
+      <w:tr>
+        <w:tc>
+          <w:tcPr>
+            <w:tcW w:type="dxa" w:w="2351"/>
+            <w:shd w:val="clear" w:color="auto" w:fill="FFFFFF"/>
+          </w:tcPr>
+          <w:p>
+            <w:r>
+              <w:rPr>
+                <w:sz w:val="18"/>
+              </w:rPr>
+              <w:t>4</w:t>
+            </w:r>
+          </w:p>
+        </w:tc>
+        <w:tc>
+          <w:tcPr>
+            <w:tcW w:type="dxa" w:w="2351"/>
+            <w:shd w:val="clear" w:color="auto" w:fill="FFFFFF"/>
+          </w:tcPr>
+          <w:p>
+            <w:r>
+              <w:rPr>
+                <w:sz w:val="18"/>
+              </w:rPr>
+              <w:t>Logistics / landlocked penalty</w:t>
+            </w:r>
+          </w:p>
+        </w:tc>
+        <w:tc>
+          <w:tcPr>
+            <w:tcW w:type="dxa" w:w="2351"/>
+            <w:shd w:val="clear" w:color="auto" w:fill="FFFFFF"/>
+          </w:tcPr>
+          <w:p>
+            <w:r>
+              <w:rPr>
+                <w:b/>
+                <w:sz w:val="18"/>
+              </w:rPr>
+              <w:t>4</w:t>
+            </w:r>
+          </w:p>
+        </w:tc>
+        <w:tc>
+          <w:tcPr>
+            <w:tcW w:type="dxa" w:w="2351"/>
+            <w:shd w:val="clear" w:color="auto" w:fill="FFFFFF"/>
+          </w:tcPr>
+          <w:p>
+            <w:r>
+              <w:rPr>
+                <w:sz w:val="18"/>
+              </w:rPr>
+              <w:t>~USD 827m/yr inefficiency; logistics ~18–20% of sale price; worst transport tier regionally</w:t>
+            </w:r>
+          </w:p>
+        </w:tc>
+      </w:tr>
+      <w:tr>
+        <w:tc>
+          <w:tcPr>
+            <w:tcW w:type="dxa" w:w="2351"/>
+            <w:shd w:val="clear" w:color="auto" w:fill="EEF3F9"/>
+          </w:tcPr>
+          <w:p>
+            <w:r>
+              <w:rPr>
+                <w:sz w:val="18"/>
+              </w:rPr>
+              <w:t>5</w:t>
+            </w:r>
+          </w:p>
+        </w:tc>
+        <w:tc>
+          <w:tcPr>
+            <w:tcW w:type="dxa" w:w="2351"/>
+            <w:shd w:val="clear" w:color="auto" w:fill="EEF3F9"/>
+          </w:tcPr>
+          <w:p>
+            <w:r>
+              <w:rPr>
+                <w:sz w:val="18"/>
+              </w:rPr>
+              <w:t>Skills</w:t>
+            </w:r>
+          </w:p>
+        </w:tc>
+        <w:tc>
+          <w:tcPr>
+            <w:tcW w:type="dxa" w:w="2351"/>
+            <w:shd w:val="clear" w:color="auto" w:fill="EEF3F9"/>
+          </w:tcPr>
+          <w:p>
+            <w:r>
+              <w:rPr>
+                <w:b/>
+                <w:sz w:val="18"/>
+              </w:rPr>
+              <w:t>3</w:t>
+            </w:r>
+          </w:p>
+        </w:tc>
+        <w:tc>
+          <w:tcPr>
+            <w:tcW w:type="dxa" w:w="2351"/>
+            <w:shd w:val="clear" w:color="auto" w:fill="EEF3F9"/>
+          </w:tcPr>
+          <w:p>
+            <w:r>
+              <w:rPr>
+                <w:sz w:val="18"/>
+              </w:rPr>
+              <w:t>~68% of manufacturers cannot find required technical skills (UMA)</w:t>
+            </w:r>
+          </w:p>
+        </w:tc>
+      </w:tr>
+      <w:tr>
+        <w:tc>
+          <w:tcPr>
+            <w:tcW w:type="dxa" w:w="2351"/>
+            <w:shd w:val="clear" w:color="auto" w:fill="FFFFFF"/>
+          </w:tcPr>
+          <w:p>
+            <w:r>
+              <w:rPr>
+                <w:sz w:val="18"/>
+              </w:rPr>
+              <w:t>6</w:t>
+            </w:r>
+          </w:p>
+        </w:tc>
+        <w:tc>
+          <w:tcPr>
+            <w:tcW w:type="dxa" w:w="2351"/>
+            <w:shd w:val="clear" w:color="auto" w:fill="FFFFFF"/>
+          </w:tcPr>
+          <w:p>
+            <w:r>
+              <w:rPr>
+                <w:sz w:val="18"/>
+              </w:rPr>
+              <w:t>Standards &amp; enforcement</w:t>
+            </w:r>
+          </w:p>
+        </w:tc>
+        <w:tc>
+          <w:tcPr>
+            <w:tcW w:type="dxa" w:w="2351"/>
+            <w:shd w:val="clear" w:color="auto" w:fill="FFFFFF"/>
+          </w:tcPr>
+          <w:p>
+            <w:r>
+              <w:rPr>
+                <w:b/>
+                <w:sz w:val="18"/>
+              </w:rPr>
+              <w:t>3</w:t>
+            </w:r>
+          </w:p>
+        </w:tc>
+        <w:tc>
+          <w:tcPr>
+            <w:tcW w:type="dxa" w:w="2351"/>
+            <w:shd w:val="clear" w:color="auto" w:fill="FFFFFF"/>
+          </w:tcPr>
+          <w:p>
+            <w:r>
+              <w:rPr>
+                <w:sz w:val="18"/>
+              </w:rPr>
+              <w:t>Sub-standard steel/cable imports distort the market; uneven UNBS enforcement</w:t>
+            </w:r>
+          </w:p>
+        </w:tc>
+      </w:tr>
+    </w:tbl>
+    <w:p/>
+    <w:p>
+      <w:r>
+        <w:t>Narrative on each:</w:t>
       </w:r>
     </w:p>
     <w:p>
@@ -21166,6 +21643,64 @@
       </w:r>
       <w:r>
         <w:t xml:space="preserve"> — infrastructure steel, electrical cable for grid expansion, and KMC buses for public fleets — as a guaranteed demand anchor that de-risks domestic investment.</w:t>
+      </w:r>
+    </w:p>
+    <w:p>
+      <w:pPr>
+        <w:pStyle w:val="Heading3"/>
+      </w:pPr>
+      <w:r>
+        <w:t>G. Green industrialisation as a competitiveness strategy</w:t>
+      </w:r>
+    </w:p>
+    <w:p>
+      <w:r>
+        <w:t xml:space="preserve">Treat decarbonisation as a cost-and-market advantage, not a burden, across the system: </w:t>
+      </w:r>
+      <w:r>
+        <w:rPr>
+          <w:b/>
+        </w:rPr>
+        <w:t>hydro-powered gas/green-hydrogen DRI and scrap-EAF steel</w:t>
+      </w:r>
+      <w:r>
+        <w:t xml:space="preserve"> (the NPA/UDC data shows gas-DRI is also the </w:t>
+      </w:r>
+      <w:r>
+        <w:rPr>
+          <w:i/>
+        </w:rPr>
+        <w:t>cheapest</w:t>
+      </w:r>
+      <w:r>
+        <w:t xml:space="preserve"> route), </w:t>
+      </w:r>
+      <w:r>
+        <w:rPr>
+          <w:b/>
+        </w:rPr>
+        <w:t>low-carbon electro-refined copper and cobalt for batteries</w:t>
+      </w:r>
+      <w:r>
+        <w:t xml:space="preserve">, </w:t>
+      </w:r>
+      <w:r>
+        <w:rPr>
+          <w:b/>
+        </w:rPr>
+        <w:t>EV manufacturing (KMC) on the hydro grid</w:t>
+      </w:r>
+      <w:r>
+        <w:t xml:space="preserve">, and </w:t>
+      </w:r>
+      <w:r>
+        <w:rPr>
+          <w:b/>
+        </w:rPr>
+        <w:t>circular links</w:t>
+      </w:r>
+      <w:r>
+        <w:t xml:space="preserve"> (steel slag and tailings into cement/construction; scrap-cable recycling). A low-carbon metals-to-mobility system hedges against carbon-border measures (e.g. EU CBAM) and differentiates Ugandan products in regional and global markets — directly serving PCP Priority Area 5.</w:t>
       </w:r>
     </w:p>
     <w:p>
@@ -21493,6 +22028,20 @@
       </w:r>
     </w:p>
     <w:p>
+      <w:pPr>
+        <w:pStyle w:val="ListNumber"/>
+      </w:pPr>
+      <w:r>
+        <w:rPr>
+          <w:b/>
+        </w:rPr>
+        <w:t>Pursue green industrialisation as a competitiveness strategy</w:t>
+      </w:r>
+      <w:r>
+        <w:t xml:space="preserve"> (hydro-powered DRI/EAF, low-carbon copper/cobalt, EVs, circular slag/tailings/scrap links).</w:t>
+      </w:r>
+    </w:p>
+    <w:p>
       <w:r>
         <w:t>These six actions, taken together, address the shared constraints that hold back all three chains and convert Uganda's resource endowment and its new industrial anchors (Tembo, Devki, Kilembe redevelopment, KMC) into a competitive metals-to-mobility industrial system.</w:t>
       </w:r>
@@ -21575,6 +22124,62 @@
     <w:p>
       <w:r>
         <w:t>This chapter consolidates the prioritized products from Chapters 4–6 into an investment portfolio and a phased implementation roadmap. It is organised to enable a decision: what to invest in, in what order, by whom, and at what indicative scale. Each priority product carries a short project profile (Section 8.3).</w:t>
+      </w:r>
+    </w:p>
+    <w:p>
+      <w:r>
+        <w:rPr>
+          <w:b/>
+        </w:rPr>
+        <w:t>Tenfold framing and the three-criteria screen.</w:t>
+      </w:r>
+      <w:r>
+        <w:t xml:space="preserve"> Every investment here is selected for its contribution to the </w:t>
+      </w:r>
+      <w:r>
+        <w:rPr>
+          <w:b/>
+        </w:rPr>
+        <w:t>Tenfold Growth Strategy</w:t>
+      </w:r>
+      <w:r>
+        <w:t xml:space="preserve">, and each is screened on three criteria </w:t>
+      </w:r>
+      <w:r>
+        <w:rPr>
+          <w:i/>
+        </w:rPr>
+        <w:t>simultaneously</w:t>
+      </w:r>
+      <w:r>
+        <w:t xml:space="preserve"> (Section 8.2): </w:t>
+      </w:r>
+      <w:r>
+        <w:rPr>
+          <w:b/>
+        </w:rPr>
+        <w:t>(1) strategic alignment to tenfold growth</w:t>
+      </w:r>
+      <w:r>
+        <w:t xml:space="preserve">, </w:t>
+      </w:r>
+      <w:r>
+        <w:rPr>
+          <w:b/>
+        </w:rPr>
+        <w:t>(2) a quick-win element</w:t>
+      </w:r>
+      <w:r>
+        <w:t xml:space="preserve"> to build early momentum, and </w:t>
+      </w:r>
+      <w:r>
+        <w:rPr>
+          <w:b/>
+        </w:rPr>
+        <w:t>(3) a green/sustainability dimension</w:t>
+      </w:r>
+      <w:r>
+        <w:t xml:space="preserve"> so that scale-up and decarbonisation advance together.</w:t>
       </w:r>
     </w:p>
     <w:p>
@@ -22341,6 +22946,619 @@
       </w:r>
     </w:p>
     <w:p>
+      <w:r>
+        <w:rPr>
+          <w:b/>
+        </w:rPr>
+        <w:t>Three-criteria screen (#13).</w:t>
+      </w:r>
+      <w:r>
+        <w:t xml:space="preserve"> Each investment is strategic, carries a quick-win element, and has a green dimension:</w:t>
+      </w:r>
+    </w:p>
+    <w:tbl>
+      <w:tblPr>
+        <w:tblStyle w:val="TableGrid"/>
+        <w:tblW w:type="auto" w:w="0"/>
+        <w:jc w:val="left"/>
+        <w:tblLook w:firstColumn="1" w:firstRow="1" w:lastColumn="0" w:lastRow="0" w:noHBand="0" w:noVBand="1" w:val="04A0"/>
+      </w:tblPr>
+      <w:tblGrid>
+        <w:gridCol w:w="1881"/>
+        <w:gridCol w:w="1881"/>
+        <w:gridCol w:w="1881"/>
+        <w:gridCol w:w="1881"/>
+        <w:gridCol w:w="1881"/>
+      </w:tblGrid>
+      <w:tr>
+        <w:tc>
+          <w:tcPr>
+            <w:tcW w:type="dxa" w:w="1881"/>
+            <w:shd w:val="clear" w:color="auto" w:fill="002B5B"/>
+          </w:tcPr>
+          <w:p>
+            <w:r>
+              <w:rPr>
+                <w:b/>
+                <w:color w:val="FFFFFF"/>
+                <w:sz w:val="18"/>
+              </w:rPr>
+              <w:t>#</w:t>
+            </w:r>
+          </w:p>
+        </w:tc>
+        <w:tc>
+          <w:tcPr>
+            <w:tcW w:type="dxa" w:w="1881"/>
+            <w:shd w:val="clear" w:color="auto" w:fill="002B5B"/>
+          </w:tcPr>
+          <w:p>
+            <w:r>
+              <w:rPr>
+                <w:b/>
+                <w:color w:val="FFFFFF"/>
+                <w:sz w:val="18"/>
+              </w:rPr>
+              <w:t>Investment</w:t>
+            </w:r>
+          </w:p>
+        </w:tc>
+        <w:tc>
+          <w:tcPr>
+            <w:tcW w:type="dxa" w:w="1881"/>
+            <w:shd w:val="clear" w:color="auto" w:fill="002B5B"/>
+          </w:tcPr>
+          <w:p>
+            <w:r>
+              <w:rPr>
+                <w:b/>
+                <w:color w:val="FFFFFF"/>
+                <w:sz w:val="18"/>
+              </w:rPr>
+              <w:t>Strategic (tenfold)</w:t>
+            </w:r>
+          </w:p>
+        </w:tc>
+        <w:tc>
+          <w:tcPr>
+            <w:tcW w:type="dxa" w:w="1881"/>
+            <w:shd w:val="clear" w:color="auto" w:fill="002B5B"/>
+          </w:tcPr>
+          <w:p>
+            <w:r>
+              <w:rPr>
+                <w:b/>
+                <w:color w:val="FFFFFF"/>
+                <w:sz w:val="18"/>
+              </w:rPr>
+              <w:t>Quick-win element</w:t>
+            </w:r>
+          </w:p>
+        </w:tc>
+        <w:tc>
+          <w:tcPr>
+            <w:tcW w:type="dxa" w:w="1881"/>
+            <w:shd w:val="clear" w:color="auto" w:fill="002B5B"/>
+          </w:tcPr>
+          <w:p>
+            <w:r>
+              <w:rPr>
+                <w:b/>
+                <w:color w:val="FFFFFF"/>
+                <w:sz w:val="18"/>
+              </w:rPr>
+              <w:t>Green dimension</w:t>
+            </w:r>
+          </w:p>
+        </w:tc>
+      </w:tr>
+      <w:tr>
+        <w:tc>
+          <w:tcPr>
+            <w:tcW w:type="dxa" w:w="1881"/>
+            <w:shd w:val="clear" w:color="auto" w:fill="EEF3F9"/>
+          </w:tcPr>
+          <w:p>
+            <w:r>
+              <w:rPr>
+                <w:sz w:val="18"/>
+              </w:rPr>
+              <w:t>1</w:t>
+            </w:r>
+          </w:p>
+        </w:tc>
+        <w:tc>
+          <w:tcPr>
+            <w:tcW w:type="dxa" w:w="1881"/>
+            <w:shd w:val="clear" w:color="auto" w:fill="EEF3F9"/>
+          </w:tcPr>
+          <w:p>
+            <w:r>
+              <w:rPr>
+                <w:sz w:val="18"/>
+              </w:rPr>
+              <w:t>Integrated steel complex</w:t>
+            </w:r>
+          </w:p>
+        </w:tc>
+        <w:tc>
+          <w:tcPr>
+            <w:tcW w:type="dxa" w:w="1881"/>
+            <w:shd w:val="clear" w:color="auto" w:fill="EEF3F9"/>
+          </w:tcPr>
+          <w:p>
+            <w:r>
+              <w:rPr>
+                <w:sz w:val="18"/>
+              </w:rPr>
+              <w:t>Backbone for tenfold-scale domestic steel</w:t>
+            </w:r>
+          </w:p>
+        </w:tc>
+        <w:tc>
+          <w:tcPr>
+            <w:tcW w:type="dxa" w:w="1881"/>
+            <w:shd w:val="clear" w:color="auto" w:fill="EEF3F9"/>
+          </w:tcPr>
+          <w:p>
+            <w:r>
+              <w:rPr>
+                <w:sz w:val="18"/>
+              </w:rPr>
+              <w:t>Phase via Tembo/Devki already underway</w:t>
+            </w:r>
+          </w:p>
+        </w:tc>
+        <w:tc>
+          <w:tcPr>
+            <w:tcW w:type="dxa" w:w="1881"/>
+            <w:shd w:val="clear" w:color="auto" w:fill="EEF3F9"/>
+          </w:tcPr>
+          <w:p>
+            <w:r>
+              <w:rPr>
+                <w:sz w:val="18"/>
+              </w:rPr>
+              <w:t>Gas/H₂-DRI + hydro-EAF; slag→cement</w:t>
+            </w:r>
+          </w:p>
+        </w:tc>
+      </w:tr>
+      <w:tr>
+        <w:tc>
+          <w:tcPr>
+            <w:tcW w:type="dxa" w:w="1881"/>
+            <w:shd w:val="clear" w:color="auto" w:fill="FFFFFF"/>
+          </w:tcPr>
+          <w:p>
+            <w:r>
+              <w:rPr>
+                <w:sz w:val="18"/>
+              </w:rPr>
+              <w:t>2</w:t>
+            </w:r>
+          </w:p>
+        </w:tc>
+        <w:tc>
+          <w:tcPr>
+            <w:tcW w:type="dxa" w:w="1881"/>
+            <w:shd w:val="clear" w:color="auto" w:fill="FFFFFF"/>
+          </w:tcPr>
+          <w:p>
+            <w:r>
+              <w:rPr>
+                <w:sz w:val="18"/>
+              </w:rPr>
+              <w:t>Flat-steel rolling mill</w:t>
+            </w:r>
+          </w:p>
+        </w:tc>
+        <w:tc>
+          <w:tcPr>
+            <w:tcW w:type="dxa" w:w="1881"/>
+            <w:shd w:val="clear" w:color="auto" w:fill="FFFFFF"/>
+          </w:tcPr>
+          <w:p>
+            <w:r>
+              <w:rPr>
+                <w:sz w:val="18"/>
+              </w:rPr>
+              <w:t>Largest import-substitution prize</w:t>
+            </w:r>
+          </w:p>
+        </w:tc>
+        <w:tc>
+          <w:tcPr>
+            <w:tcW w:type="dxa" w:w="1881"/>
+            <w:shd w:val="clear" w:color="auto" w:fill="FFFFFF"/>
+          </w:tcPr>
+          <w:p>
+            <w:r>
+              <w:rPr>
+                <w:sz w:val="18"/>
+              </w:rPr>
+              <w:t>Cold-rolling/coating line starts on imported coil</w:t>
+            </w:r>
+          </w:p>
+        </w:tc>
+        <w:tc>
+          <w:tcPr>
+            <w:tcW w:type="dxa" w:w="1881"/>
+            <w:shd w:val="clear" w:color="auto" w:fill="FFFFFF"/>
+          </w:tcPr>
+          <w:p>
+            <w:r>
+              <w:rPr>
+                <w:sz w:val="18"/>
+              </w:rPr>
+              <w:t>Hydro-powered, efficient lines</w:t>
+            </w:r>
+          </w:p>
+        </w:tc>
+      </w:tr>
+      <w:tr>
+        <w:tc>
+          <w:tcPr>
+            <w:tcW w:type="dxa" w:w="1881"/>
+            <w:shd w:val="clear" w:color="auto" w:fill="EEF3F9"/>
+          </w:tcPr>
+          <w:p>
+            <w:r>
+              <w:rPr>
+                <w:sz w:val="18"/>
+              </w:rPr>
+              <w:t>3</w:t>
+            </w:r>
+          </w:p>
+        </w:tc>
+        <w:tc>
+          <w:tcPr>
+            <w:tcW w:type="dxa" w:w="1881"/>
+            <w:shd w:val="clear" w:color="auto" w:fill="EEF3F9"/>
+          </w:tcPr>
+          <w:p>
+            <w:r>
+              <w:rPr>
+                <w:sz w:val="18"/>
+              </w:rPr>
+              <w:t>Iron-ore mining &amp; beneficiation</w:t>
+            </w:r>
+          </w:p>
+        </w:tc>
+        <w:tc>
+          <w:tcPr>
+            <w:tcW w:type="dxa" w:w="1881"/>
+            <w:shd w:val="clear" w:color="auto" w:fill="EEF3F9"/>
+          </w:tcPr>
+          <w:p>
+            <w:r>
+              <w:rPr>
+                <w:sz w:val="18"/>
+              </w:rPr>
+              <w:t>Enables domestic ironmaking</w:t>
+            </w:r>
+          </w:p>
+        </w:tc>
+        <w:tc>
+          <w:tcPr>
+            <w:tcW w:type="dxa" w:w="1881"/>
+            <w:shd w:val="clear" w:color="auto" w:fill="EEF3F9"/>
+          </w:tcPr>
+          <w:p>
+            <w:r>
+              <w:rPr>
+                <w:sz w:val="18"/>
+              </w:rPr>
+              <w:t>Scale an existing miner via UDC</w:t>
+            </w:r>
+          </w:p>
+        </w:tc>
+        <w:tc>
+          <w:tcPr>
+            <w:tcW w:type="dxa" w:w="1881"/>
+            <w:shd w:val="clear" w:color="auto" w:fill="EEF3F9"/>
+          </w:tcPr>
+          <w:p>
+            <w:r>
+              <w:rPr>
+                <w:sz w:val="18"/>
+              </w:rPr>
+              <w:t>On-site beneficiation; rail vs road</w:t>
+            </w:r>
+          </w:p>
+        </w:tc>
+      </w:tr>
+      <w:tr>
+        <w:tc>
+          <w:tcPr>
+            <w:tcW w:type="dxa" w:w="1881"/>
+            <w:shd w:val="clear" w:color="auto" w:fill="FFFFFF"/>
+          </w:tcPr>
+          <w:p>
+            <w:r>
+              <w:rPr>
+                <w:sz w:val="18"/>
+              </w:rPr>
+              <w:t>4</w:t>
+            </w:r>
+          </w:p>
+        </w:tc>
+        <w:tc>
+          <w:tcPr>
+            <w:tcW w:type="dxa" w:w="1881"/>
+            <w:shd w:val="clear" w:color="auto" w:fill="FFFFFF"/>
+          </w:tcPr>
+          <w:p>
+            <w:r>
+              <w:rPr>
+                <w:sz w:val="18"/>
+              </w:rPr>
+              <w:t>Kilembe copper–cobalt</w:t>
+            </w:r>
+          </w:p>
+        </w:tc>
+        <w:tc>
+          <w:tcPr>
+            <w:tcW w:type="dxa" w:w="1881"/>
+            <w:shd w:val="clear" w:color="auto" w:fill="FFFFFF"/>
+          </w:tcPr>
+          <w:p>
+            <w:r>
+              <w:rPr>
+                <w:sz w:val="18"/>
+              </w:rPr>
+              <w:t>Reopens midstream; battery minerals</w:t>
+            </w:r>
+          </w:p>
+        </w:tc>
+        <w:tc>
+          <w:tcPr>
+            <w:tcW w:type="dxa" w:w="1881"/>
+            <w:shd w:val="clear" w:color="auto" w:fill="FFFFFF"/>
+          </w:tcPr>
+          <w:p>
+            <w:r>
+              <w:rPr>
+                <w:sz w:val="18"/>
+              </w:rPr>
+              <w:t>2025 PSA signed; tailings reprocessing first</w:t>
+            </w:r>
+          </w:p>
+        </w:tc>
+        <w:tc>
+          <w:tcPr>
+            <w:tcW w:type="dxa" w:w="1881"/>
+            <w:shd w:val="clear" w:color="auto" w:fill="FFFFFF"/>
+          </w:tcPr>
+          <w:p>
+            <w:r>
+              <w:rPr>
+                <w:sz w:val="18"/>
+              </w:rPr>
+              <w:t>Hydro electro-refining; tailings recovery</w:t>
+            </w:r>
+          </w:p>
+        </w:tc>
+      </w:tr>
+      <w:tr>
+        <w:tc>
+          <w:tcPr>
+            <w:tcW w:type="dxa" w:w="1881"/>
+            <w:shd w:val="clear" w:color="auto" w:fill="EEF3F9"/>
+          </w:tcPr>
+          <w:p>
+            <w:r>
+              <w:rPr>
+                <w:sz w:val="18"/>
+              </w:rPr>
+              <w:t>5</w:t>
+            </w:r>
+          </w:p>
+        </w:tc>
+        <w:tc>
+          <w:tcPr>
+            <w:tcW w:type="dxa" w:w="1881"/>
+            <w:shd w:val="clear" w:color="auto" w:fill="EEF3F9"/>
+          </w:tcPr>
+          <w:p>
+            <w:r>
+              <w:rPr>
+                <w:sz w:val="18"/>
+              </w:rPr>
+              <w:t>Cable &amp; conductor expansion</w:t>
+            </w:r>
+          </w:p>
+        </w:tc>
+        <w:tc>
+          <w:tcPr>
+            <w:tcW w:type="dxa" w:w="1881"/>
+            <w:shd w:val="clear" w:color="auto" w:fill="EEF3F9"/>
+          </w:tcPr>
+          <w:p>
+            <w:r>
+              <w:rPr>
+                <w:sz w:val="18"/>
+              </w:rPr>
+              <w:t>Captures electrification demand</w:t>
+            </w:r>
+          </w:p>
+        </w:tc>
+        <w:tc>
+          <w:tcPr>
+            <w:tcW w:type="dxa" w:w="1881"/>
+            <w:shd w:val="clear" w:color="auto" w:fill="EEF3F9"/>
+          </w:tcPr>
+          <w:p>
+            <w:r>
+              <w:rPr>
+                <w:sz w:val="18"/>
+              </w:rPr>
+              <w:t>Expands proven Cable Corp base</w:t>
+            </w:r>
+          </w:p>
+        </w:tc>
+        <w:tc>
+          <w:tcPr>
+            <w:tcW w:type="dxa" w:w="1881"/>
+            <w:shd w:val="clear" w:color="auto" w:fill="EEF3F9"/>
+          </w:tcPr>
+          <w:p>
+            <w:r>
+              <w:rPr>
+                <w:sz w:val="18"/>
+              </w:rPr>
+              <w:t>Hydro power; scrap-copper recycling</w:t>
+            </w:r>
+          </w:p>
+        </w:tc>
+      </w:tr>
+      <w:tr>
+        <w:tc>
+          <w:tcPr>
+            <w:tcW w:type="dxa" w:w="1881"/>
+            <w:shd w:val="clear" w:color="auto" w:fill="FFFFFF"/>
+          </w:tcPr>
+          <w:p>
+            <w:r>
+              <w:rPr>
+                <w:sz w:val="18"/>
+              </w:rPr>
+              <w:t>6</w:t>
+            </w:r>
+          </w:p>
+        </w:tc>
+        <w:tc>
+          <w:tcPr>
+            <w:tcW w:type="dxa" w:w="1881"/>
+            <w:shd w:val="clear" w:color="auto" w:fill="FFFFFF"/>
+          </w:tcPr>
+          <w:p>
+            <w:r>
+              <w:rPr>
+                <w:sz w:val="18"/>
+              </w:rPr>
+              <w:t>KMC buses/EVs</w:t>
+            </w:r>
+          </w:p>
+        </w:tc>
+        <w:tc>
+          <w:tcPr>
+            <w:tcW w:type="dxa" w:w="1881"/>
+            <w:shd w:val="clear" w:color="auto" w:fill="FFFFFF"/>
+          </w:tcPr>
+          <w:p>
+            <w:r>
+              <w:rPr>
+                <w:sz w:val="18"/>
+              </w:rPr>
+              <w:t>State-anchored mobility industry</w:t>
+            </w:r>
+          </w:p>
+        </w:tc>
+        <w:tc>
+          <w:tcPr>
+            <w:tcW w:type="dxa" w:w="1881"/>
+            <w:shd w:val="clear" w:color="auto" w:fill="FFFFFF"/>
+          </w:tcPr>
+          <w:p>
+            <w:r>
+              <w:rPr>
+                <w:sz w:val="18"/>
+              </w:rPr>
+              <w:t>Plant commissioned; fleet procurement</w:t>
+            </w:r>
+          </w:p>
+        </w:tc>
+        <w:tc>
+          <w:tcPr>
+            <w:tcW w:type="dxa" w:w="1881"/>
+            <w:shd w:val="clear" w:color="auto" w:fill="FFFFFF"/>
+          </w:tcPr>
+          <w:p>
+            <w:r>
+              <w:rPr>
+                <w:sz w:val="18"/>
+              </w:rPr>
+              <w:t>Electric buses on hydro grid</w:t>
+            </w:r>
+          </w:p>
+        </w:tc>
+      </w:tr>
+      <w:tr>
+        <w:tc>
+          <w:tcPr>
+            <w:tcW w:type="dxa" w:w="1881"/>
+            <w:shd w:val="clear" w:color="auto" w:fill="EEF3F9"/>
+          </w:tcPr>
+          <w:p>
+            <w:r>
+              <w:rPr>
+                <w:sz w:val="18"/>
+              </w:rPr>
+              <w:t>7</w:t>
+            </w:r>
+          </w:p>
+        </w:tc>
+        <w:tc>
+          <w:tcPr>
+            <w:tcW w:type="dxa" w:w="1881"/>
+            <w:shd w:val="clear" w:color="auto" w:fill="EEF3F9"/>
+          </w:tcPr>
+          <w:p>
+            <w:r>
+              <w:rPr>
+                <w:sz w:val="18"/>
+              </w:rPr>
+              <w:t>Motorcycle CKD/e-boda</w:t>
+            </w:r>
+          </w:p>
+        </w:tc>
+        <w:tc>
+          <w:tcPr>
+            <w:tcW w:type="dxa" w:w="1881"/>
+            <w:shd w:val="clear" w:color="auto" w:fill="EEF3F9"/>
+          </w:tcPr>
+          <w:p>
+            <w:r>
+              <w:rPr>
+                <w:sz w:val="18"/>
+              </w:rPr>
+              <w:t>Largest-volume mobility market</w:t>
+            </w:r>
+          </w:p>
+        </w:tc>
+        <w:tc>
+          <w:tcPr>
+            <w:tcW w:type="dxa" w:w="1881"/>
+            <w:shd w:val="clear" w:color="auto" w:fill="EEF3F9"/>
+          </w:tcPr>
+          <w:p>
+            <w:r>
+              <w:rPr>
+                <w:sz w:val="18"/>
+              </w:rPr>
+              <w:t>CKD assembly feasible now</w:t>
+            </w:r>
+          </w:p>
+        </w:tc>
+        <w:tc>
+          <w:tcPr>
+            <w:tcW w:type="dxa" w:w="1881"/>
+            <w:shd w:val="clear" w:color="auto" w:fill="EEF3F9"/>
+          </w:tcPr>
+          <w:p>
+            <w:r>
+              <w:rPr>
+                <w:sz w:val="18"/>
+              </w:rPr>
+              <w:t>Transition to electric boda</w:t>
+            </w:r>
+          </w:p>
+        </w:tc>
+      </w:tr>
+    </w:tbl>
+    <w:p/>
+    <w:p>
       <w:pPr>
         <w:pStyle w:val="Heading2"/>
       </w:pPr>
@@ -23088,6 +24306,1106 @@
       </w:r>
       <w:r>
         <w:t>. These figures are indicative and require feasibility confirmation.</w:t>
+      </w:r>
+    </w:p>
+    <w:p>
+      <w:r>
+        <w:br w:type="page"/>
+      </w:r>
+    </w:p>
+    <w:p>
+      <w:pPr>
+        <w:pStyle w:val="Heading1"/>
+      </w:pPr>
+      <w:r>
+        <w:t>Annex A: Value Chain Status Reports (Sector Snapshots)</w:t>
+      </w:r>
+    </w:p>
+    <w:p>
+      <w:r>
+        <w:t xml:space="preserve">These one-page </w:t>
+      </w:r>
+      <w:r>
+        <w:rPr>
+          <w:b/>
+        </w:rPr>
+        <w:t>sector snapshots</w:t>
+      </w:r>
+      <w:r>
+        <w:t xml:space="preserve"> distil the current status, market, constraints, priorities and green opportunity for each value chain in this report. Each is designed to be </w:t>
+      </w:r>
+      <w:r>
+        <w:rPr>
+          <w:b/>
+        </w:rPr>
+        <w:t>extracted and shared independently</w:t>
+      </w:r>
+      <w:r>
+        <w:t xml:space="preserve"> as a quick-reference brief. Figures and sources are detailed in the corresponding chapter (4–6) and the consolidated References.</w:t>
+      </w:r>
+    </w:p>
+    <w:p>
+      <w:pPr>
+        <w:pStyle w:val="Heading2"/>
+      </w:pPr>
+      <w:r>
+        <w:t>A.1 Iron &amp; Steel — Status Snapshot</w:t>
+      </w:r>
+    </w:p>
+    <w:tbl>
+      <w:tblPr>
+        <w:tblStyle w:val="TableGrid"/>
+        <w:tblW w:type="auto" w:w="0"/>
+        <w:jc w:val="left"/>
+        <w:tblLook w:firstColumn="1" w:firstRow="1" w:lastColumn="0" w:lastRow="0" w:noHBand="0" w:noVBand="1" w:val="04A0"/>
+      </w:tblPr>
+      <w:tblGrid>
+        <w:gridCol w:w="4703"/>
+        <w:gridCol w:w="4703"/>
+      </w:tblGrid>
+      <w:tr>
+        <w:tc>
+          <w:tcPr>
+            <w:tcW w:type="dxa" w:w="4703"/>
+            <w:shd w:val="clear" w:color="auto" w:fill="002B5B"/>
+          </w:tcPr>
+          <w:p>
+            <w:r>
+              <w:rPr>
+                <w:b/>
+                <w:color w:val="FFFFFF"/>
+                <w:sz w:val="18"/>
+              </w:rPr>
+              <w:t>Indicator</w:t>
+            </w:r>
+          </w:p>
+        </w:tc>
+        <w:tc>
+          <w:tcPr>
+            <w:tcW w:type="dxa" w:w="4703"/>
+            <w:shd w:val="clear" w:color="auto" w:fill="002B5B"/>
+          </w:tcPr>
+          <w:p>
+            <w:r>
+              <w:rPr>
+                <w:b/>
+                <w:color w:val="FFFFFF"/>
+                <w:sz w:val="18"/>
+              </w:rPr>
+              <w:t>Value (2024/25)</w:t>
+            </w:r>
+          </w:p>
+        </w:tc>
+      </w:tr>
+      <w:tr>
+        <w:tc>
+          <w:tcPr>
+            <w:tcW w:type="dxa" w:w="4703"/>
+            <w:shd w:val="clear" w:color="auto" w:fill="EEF3F9"/>
+          </w:tcPr>
+          <w:p>
+            <w:r>
+              <w:rPr>
+                <w:sz w:val="18"/>
+              </w:rPr>
+              <w:t>Installed capacity / utilisation</w:t>
+            </w:r>
+          </w:p>
+        </w:tc>
+        <w:tc>
+          <w:tcPr>
+            <w:tcW w:type="dxa" w:w="4703"/>
+            <w:shd w:val="clear" w:color="auto" w:fill="EEF3F9"/>
+          </w:tcPr>
+          <w:p>
+            <w:r>
+              <w:rPr>
+                <w:b/>
+                <w:sz w:val="18"/>
+              </w:rPr>
+              <w:t>1,682,779 tpa / 30.5%</w:t>
+            </w:r>
+          </w:p>
+        </w:tc>
+      </w:tr>
+      <w:tr>
+        <w:tc>
+          <w:tcPr>
+            <w:tcW w:type="dxa" w:w="4703"/>
+            <w:shd w:val="clear" w:color="auto" w:fill="FFFFFF"/>
+          </w:tcPr>
+          <w:p>
+            <w:r>
+              <w:rPr>
+                <w:sz w:val="18"/>
+              </w:rPr>
+              <w:t>Iron-ore reserves</w:t>
+            </w:r>
+          </w:p>
+        </w:tc>
+        <w:tc>
+          <w:tcPr>
+            <w:tcW w:type="dxa" w:w="4703"/>
+            <w:shd w:val="clear" w:color="auto" w:fill="FFFFFF"/>
+          </w:tcPr>
+          <w:p>
+            <w:r>
+              <w:rPr>
+                <w:sz w:val="18"/>
+              </w:rPr>
+              <w:t>~350 million tonnes</w:t>
+            </w:r>
+          </w:p>
+        </w:tc>
+      </w:tr>
+      <w:tr>
+        <w:tc>
+          <w:tcPr>
+            <w:tcW w:type="dxa" w:w="4703"/>
+            <w:shd w:val="clear" w:color="auto" w:fill="EEF3F9"/>
+          </w:tcPr>
+          <w:p>
+            <w:r>
+              <w:rPr>
+                <w:sz w:val="18"/>
+              </w:rPr>
+              <w:t>Sponge-iron (Phase II)</w:t>
+            </w:r>
+          </w:p>
+        </w:tc>
+        <w:tc>
+          <w:tcPr>
+            <w:tcW w:type="dxa" w:w="4703"/>
+            <w:shd w:val="clear" w:color="auto" w:fill="EEF3F9"/>
+          </w:tcPr>
+          <w:p>
+            <w:r>
+              <w:rPr>
+                <w:sz w:val="18"/>
+              </w:rPr>
+              <w:t>~400,000 tpa (Tembo Iganga 350k; Abyssinia Jinja 30k)</w:t>
+            </w:r>
+          </w:p>
+        </w:tc>
+      </w:tr>
+      <w:tr>
+        <w:tc>
+          <w:tcPr>
+            <w:tcW w:type="dxa" w:w="4703"/>
+            <w:shd w:val="clear" w:color="auto" w:fill="FFFFFF"/>
+          </w:tcPr>
+          <w:p>
+            <w:r>
+              <w:rPr>
+                <w:sz w:val="18"/>
+              </w:rPr>
+              <w:t>Industry investment</w:t>
+            </w:r>
+          </w:p>
+        </w:tc>
+        <w:tc>
+          <w:tcPr>
+            <w:tcW w:type="dxa" w:w="4703"/>
+            <w:shd w:val="clear" w:color="auto" w:fill="FFFFFF"/>
+          </w:tcPr>
+          <w:p>
+            <w:r>
+              <w:rPr>
+                <w:sz w:val="18"/>
+              </w:rPr>
+              <w:t>&gt; USD 1 billion</w:t>
+            </w:r>
+          </w:p>
+        </w:tc>
+      </w:tr>
+      <w:tr>
+        <w:tc>
+          <w:tcPr>
+            <w:tcW w:type="dxa" w:w="4703"/>
+            <w:shd w:val="clear" w:color="auto" w:fill="EEF3F9"/>
+          </w:tcPr>
+          <w:p>
+            <w:r>
+              <w:rPr>
+                <w:sz w:val="18"/>
+              </w:rPr>
+              <w:t>Direct jobs</w:t>
+            </w:r>
+          </w:p>
+        </w:tc>
+        <w:tc>
+          <w:tcPr>
+            <w:tcW w:type="dxa" w:w="4703"/>
+            <w:shd w:val="clear" w:color="auto" w:fill="EEF3F9"/>
+          </w:tcPr>
+          <w:p>
+            <w:r>
+              <w:rPr>
+                <w:sz w:val="18"/>
+              </w:rPr>
+              <w:t>~2,500 (+ large indirect)</w:t>
+            </w:r>
+          </w:p>
+        </w:tc>
+      </w:tr>
+      <w:tr>
+        <w:tc>
+          <w:tcPr>
+            <w:tcW w:type="dxa" w:w="4703"/>
+            <w:shd w:val="clear" w:color="auto" w:fill="FFFFFF"/>
+          </w:tcPr>
+          <w:p>
+            <w:r>
+              <w:rPr>
+                <w:sz w:val="18"/>
+              </w:rPr>
+              <w:t>Largest import</w:t>
+            </w:r>
+          </w:p>
+        </w:tc>
+        <w:tc>
+          <w:tcPr>
+            <w:tcW w:type="dxa" w:w="4703"/>
+            <w:shd w:val="clear" w:color="auto" w:fill="FFFFFF"/>
+          </w:tcPr>
+          <w:p>
+            <w:r>
+              <w:rPr>
+                <w:sz w:val="18"/>
+              </w:rPr>
+              <w:t xml:space="preserve">Flat steel (HS 7208) — </w:t>
+            </w:r>
+            <w:r>
+              <w:rPr>
+                <w:b/>
+                <w:sz w:val="18"/>
+              </w:rPr>
+              <w:t>USD 219.5m</w:t>
+            </w:r>
+          </w:p>
+        </w:tc>
+      </w:tr>
+      <w:tr>
+        <w:tc>
+          <w:tcPr>
+            <w:tcW w:type="dxa" w:w="4703"/>
+            <w:shd w:val="clear" w:color="auto" w:fill="EEF3F9"/>
+          </w:tcPr>
+          <w:p>
+            <w:r>
+              <w:rPr>
+                <w:sz w:val="18"/>
+              </w:rPr>
+              <w:t>Competitive export</w:t>
+            </w:r>
+          </w:p>
+        </w:tc>
+        <w:tc>
+          <w:tcPr>
+            <w:tcW w:type="dxa" w:w="4703"/>
+            <w:shd w:val="clear" w:color="auto" w:fill="EEF3F9"/>
+          </w:tcPr>
+          <w:p>
+            <w:r>
+              <w:rPr>
+                <w:sz w:val="18"/>
+              </w:rPr>
+              <w:t xml:space="preserve">Rebar (HS 7214) — </w:t>
+            </w:r>
+            <w:r>
+              <w:rPr>
+                <w:b/>
+                <w:sz w:val="18"/>
+              </w:rPr>
+              <w:t>USD 55.8m</w:t>
+            </w:r>
+          </w:p>
+        </w:tc>
+      </w:tr>
+      <w:tr>
+        <w:tc>
+          <w:tcPr>
+            <w:tcW w:type="dxa" w:w="4703"/>
+            <w:shd w:val="clear" w:color="auto" w:fill="FFFFFF"/>
+          </w:tcPr>
+          <w:p>
+            <w:r>
+              <w:rPr>
+                <w:sz w:val="18"/>
+              </w:rPr>
+              <w:t>Cost penalty</w:t>
+            </w:r>
+          </w:p>
+        </w:tc>
+        <w:tc>
+          <w:tcPr>
+            <w:tcW w:type="dxa" w:w="4703"/>
+            <w:shd w:val="clear" w:color="auto" w:fill="FFFFFF"/>
+          </w:tcPr>
+          <w:p>
+            <w:r>
+              <w:rPr>
+                <w:sz w:val="18"/>
+              </w:rPr>
+              <w:t>Imported-scrap billet ~USD 676/t vs gas-DRI ~USD 478/t</w:t>
+            </w:r>
+          </w:p>
+        </w:tc>
+      </w:tr>
+    </w:tbl>
+    <w:p/>
+    <w:p>
+      <w:pPr>
+        <w:pStyle w:val="ListBullet"/>
+      </w:pPr>
+      <w:r>
+        <w:rPr>
+          <w:b/>
+        </w:rPr>
+        <w:t>Position:</w:t>
+      </w:r>
+      <w:r>
+        <w:t xml:space="preserve"> strong downstream (rolling, ~70% of capacity); critical gap upstream (ironmaking/steelmaking); exports ore raw.</w:t>
+      </w:r>
+    </w:p>
+    <w:p>
+      <w:pPr>
+        <w:pStyle w:val="ListBullet"/>
+      </w:pPr>
+      <w:r>
+        <w:rPr>
+          <w:b/>
+        </w:rPr>
+        <w:t>Top constraints (weighted):</w:t>
+      </w:r>
+      <w:r>
+        <w:t xml:space="preserve"> upstream feedstock gap (5); electricity reliability &amp; cost (5, ~8–10¢ vs peers); market/standards &amp; import competition (4); capital for upstream (4).</w:t>
+      </w:r>
+    </w:p>
+    <w:p>
+      <w:pPr>
+        <w:pStyle w:val="ListBullet"/>
+      </w:pPr>
+      <w:r>
+        <w:rPr>
+          <w:b/>
+        </w:rPr>
+        <w:t>Priorities:</w:t>
+      </w:r>
+      <w:r>
+        <w:t xml:space="preserve"> ① Ironmaking (DRI on domestic ore) ② Flat-steel production ③ Long products (defend &amp; expand) ④ Iron-ore mining &amp; beneficiation.</w:t>
+      </w:r>
+    </w:p>
+    <w:p>
+      <w:pPr>
+        <w:pStyle w:val="ListBullet"/>
+      </w:pPr>
+      <w:r>
+        <w:rPr>
+          <w:b/>
+        </w:rPr>
+        <w:t>2040 (tenfold):</w:t>
+      </w:r>
+      <w:r>
+        <w:t xml:space="preserve"> demand ~1 Mtpa → </w:t>
+      </w:r>
+      <w:r>
+        <w:rPr>
+          <w:b/>
+        </w:rPr>
+        <w:t>~5.5–8 Mtpa</w:t>
+      </w:r>
+      <w:r>
+        <w:t>.</w:t>
+      </w:r>
+    </w:p>
+    <w:p>
+      <w:pPr>
+        <w:pStyle w:val="ListBullet"/>
+      </w:pPr>
+      <w:r>
+        <w:rPr>
+          <w:b/>
+        </w:rPr>
+        <w:t>Green edge:</w:t>
+      </w:r>
+      <w:r>
+        <w:t xml:space="preserve"> gas/H₂-DRI + hydro-EAF (also cheapest); slag → cement.</w:t>
+      </w:r>
+    </w:p>
+    <w:p>
+      <w:pPr>
+        <w:pStyle w:val="Heading2"/>
+      </w:pPr>
+      <w:r>
+        <w:t>A.2 Copper &amp; Allied Metals — Status Snapshot</w:t>
+      </w:r>
+    </w:p>
+    <w:tbl>
+      <w:tblPr>
+        <w:tblStyle w:val="TableGrid"/>
+        <w:tblW w:type="auto" w:w="0"/>
+        <w:jc w:val="left"/>
+        <w:tblLook w:firstColumn="1" w:firstRow="1" w:lastColumn="0" w:lastRow="0" w:noHBand="0" w:noVBand="1" w:val="04A0"/>
+      </w:tblPr>
+      <w:tblGrid>
+        <w:gridCol w:w="4703"/>
+        <w:gridCol w:w="4703"/>
+      </w:tblGrid>
+      <w:tr>
+        <w:tc>
+          <w:tcPr>
+            <w:tcW w:type="dxa" w:w="4703"/>
+            <w:shd w:val="clear" w:color="auto" w:fill="002B5B"/>
+          </w:tcPr>
+          <w:p>
+            <w:r>
+              <w:rPr>
+                <w:b/>
+                <w:color w:val="FFFFFF"/>
+                <w:sz w:val="18"/>
+              </w:rPr>
+              <w:t>Indicator</w:t>
+            </w:r>
+          </w:p>
+        </w:tc>
+        <w:tc>
+          <w:tcPr>
+            <w:tcW w:type="dxa" w:w="4703"/>
+            <w:shd w:val="clear" w:color="auto" w:fill="002B5B"/>
+          </w:tcPr>
+          <w:p>
+            <w:r>
+              <w:rPr>
+                <w:b/>
+                <w:color w:val="FFFFFF"/>
+                <w:sz w:val="18"/>
+              </w:rPr>
+              <w:t>Value</w:t>
+            </w:r>
+          </w:p>
+        </w:tc>
+      </w:tr>
+      <w:tr>
+        <w:tc>
+          <w:tcPr>
+            <w:tcW w:type="dxa" w:w="4703"/>
+            <w:shd w:val="clear" w:color="auto" w:fill="EEF3F9"/>
+          </w:tcPr>
+          <w:p>
+            <w:r>
+              <w:rPr>
+                <w:sz w:val="18"/>
+              </w:rPr>
+              <w:t>Kilembe reserves</w:t>
+            </w:r>
+          </w:p>
+        </w:tc>
+        <w:tc>
+          <w:tcPr>
+            <w:tcW w:type="dxa" w:w="4703"/>
+            <w:shd w:val="clear" w:color="auto" w:fill="EEF3F9"/>
+          </w:tcPr>
+          <w:p>
+            <w:r>
+              <w:rPr>
+                <w:sz w:val="18"/>
+              </w:rPr>
+              <w:t>&gt;6.5 Mt ore @ 1.77% Cu; ~5.5 Mt @ 0.17% cobalt</w:t>
+            </w:r>
+          </w:p>
+        </w:tc>
+      </w:tr>
+      <w:tr>
+        <w:tc>
+          <w:tcPr>
+            <w:tcW w:type="dxa" w:w="4703"/>
+            <w:shd w:val="clear" w:color="auto" w:fill="FFFFFF"/>
+          </w:tcPr>
+          <w:p>
+            <w:r>
+              <w:rPr>
+                <w:sz w:val="18"/>
+              </w:rPr>
+              <w:t>Mine status</w:t>
+            </w:r>
+          </w:p>
+        </w:tc>
+        <w:tc>
+          <w:tcPr>
+            <w:tcW w:type="dxa" w:w="4703"/>
+            <w:shd w:val="clear" w:color="auto" w:fill="FFFFFF"/>
+          </w:tcPr>
+          <w:p>
+            <w:r>
+              <w:rPr>
+                <w:sz w:val="18"/>
+              </w:rPr>
+              <w:t xml:space="preserve">Dormant since 1980s; </w:t>
+            </w:r>
+            <w:r>
+              <w:rPr>
+                <w:b/>
+                <w:sz w:val="18"/>
+              </w:rPr>
+              <w:t>production-sharing agreement Mar 2025</w:t>
+            </w:r>
+          </w:p>
+        </w:tc>
+      </w:tr>
+      <w:tr>
+        <w:tc>
+          <w:tcPr>
+            <w:tcW w:type="dxa" w:w="4703"/>
+            <w:shd w:val="clear" w:color="auto" w:fill="EEF3F9"/>
+          </w:tcPr>
+          <w:p>
+            <w:r>
+              <w:rPr>
+                <w:sz w:val="18"/>
+              </w:rPr>
+              <w:t>Largest import</w:t>
+            </w:r>
+          </w:p>
+        </w:tc>
+        <w:tc>
+          <w:tcPr>
+            <w:tcW w:type="dxa" w:w="4703"/>
+            <w:shd w:val="clear" w:color="auto" w:fill="EEF3F9"/>
+          </w:tcPr>
+          <w:p>
+            <w:r>
+              <w:rPr>
+                <w:sz w:val="18"/>
+              </w:rPr>
+              <w:t xml:space="preserve">Insulated cable (HS 8544) — </w:t>
+            </w:r>
+            <w:r>
+              <w:rPr>
+                <w:b/>
+                <w:sz w:val="18"/>
+              </w:rPr>
+              <w:t>USD 57.7m</w:t>
+            </w:r>
+            <w:r>
+              <w:rPr>
+                <w:sz w:val="18"/>
+              </w:rPr>
+              <w:t xml:space="preserve"> (rising)</w:t>
+            </w:r>
+          </w:p>
+        </w:tc>
+      </w:tr>
+      <w:tr>
+        <w:tc>
+          <w:tcPr>
+            <w:tcW w:type="dxa" w:w="4703"/>
+            <w:shd w:val="clear" w:color="auto" w:fill="FFFFFF"/>
+          </w:tcPr>
+          <w:p>
+            <w:r>
+              <w:rPr>
+                <w:sz w:val="18"/>
+              </w:rPr>
+              <w:t>Feedstock imports</w:t>
+            </w:r>
+          </w:p>
+        </w:tc>
+        <w:tc>
+          <w:tcPr>
+            <w:tcW w:type="dxa" w:w="4703"/>
+            <w:shd w:val="clear" w:color="auto" w:fill="FFFFFF"/>
+          </w:tcPr>
+          <w:p>
+            <w:r>
+              <w:rPr>
+                <w:sz w:val="18"/>
+              </w:rPr>
+              <w:t>Cathode (7403) USD 6.9m + wire (7408) USD 3.1m</w:t>
+            </w:r>
+          </w:p>
+        </w:tc>
+      </w:tr>
+      <w:tr>
+        <w:tc>
+          <w:tcPr>
+            <w:tcW w:type="dxa" w:w="4703"/>
+            <w:shd w:val="clear" w:color="auto" w:fill="EEF3F9"/>
+          </w:tcPr>
+          <w:p>
+            <w:r>
+              <w:rPr>
+                <w:sz w:val="18"/>
+              </w:rPr>
+              <w:t>Lead fabricator</w:t>
+            </w:r>
+          </w:p>
+        </w:tc>
+        <w:tc>
+          <w:tcPr>
+            <w:tcW w:type="dxa" w:w="4703"/>
+            <w:shd w:val="clear" w:color="auto" w:fill="EEF3F9"/>
+          </w:tcPr>
+          <w:p>
+            <w:r>
+              <w:rPr>
+                <w:sz w:val="18"/>
+              </w:rPr>
+              <w:t xml:space="preserve">Cable Corporation (est. 1968) — </w:t>
+            </w:r>
+            <w:r>
+              <w:rPr>
+                <w:b/>
+                <w:sz w:val="18"/>
+              </w:rPr>
+              <w:t>~65% market</w:t>
+            </w:r>
+          </w:p>
+        </w:tc>
+      </w:tr>
+      <w:tr>
+        <w:tc>
+          <w:tcPr>
+            <w:tcW w:type="dxa" w:w="4703"/>
+            <w:shd w:val="clear" w:color="auto" w:fill="FFFFFF"/>
+          </w:tcPr>
+          <w:p>
+            <w:r>
+              <w:rPr>
+                <w:sz w:val="18"/>
+              </w:rPr>
+              <w:t>Demand driver</w:t>
+            </w:r>
+          </w:p>
+        </w:tc>
+        <w:tc>
+          <w:tcPr>
+            <w:tcW w:type="dxa" w:w="4703"/>
+            <w:shd w:val="clear" w:color="auto" w:fill="FFFFFF"/>
+          </w:tcPr>
+          <w:p>
+            <w:r>
+              <w:rPr>
+                <w:sz w:val="18"/>
+              </w:rPr>
+              <w:t xml:space="preserve">Grid access only </w:t>
+            </w:r>
+            <w:r>
+              <w:rPr>
+                <w:b/>
+                <w:sz w:val="18"/>
+              </w:rPr>
+              <w:t>25.3%</w:t>
+            </w:r>
+            <w:r>
+              <w:rPr>
+                <w:sz w:val="18"/>
+              </w:rPr>
+              <w:t xml:space="preserve"> (UBOS 2024)</w:t>
+            </w:r>
+          </w:p>
+        </w:tc>
+      </w:tr>
+    </w:tbl>
+    <w:p/>
+    <w:p>
+      <w:pPr>
+        <w:pStyle w:val="ListBullet"/>
+      </w:pPr>
+      <w:r>
+        <w:rPr>
+          <w:b/>
+        </w:rPr>
+        <w:t>Position:</w:t>
+      </w:r>
+      <w:r>
+        <w:t xml:space="preserve"> dormant midstream (mining/refining); strong, competitive downstream cable industry running on imported metal.</w:t>
+      </w:r>
+    </w:p>
+    <w:p>
+      <w:pPr>
+        <w:pStyle w:val="ListBullet"/>
+      </w:pPr>
+      <w:r>
+        <w:rPr>
+          <w:b/>
+        </w:rPr>
+        <w:t>Top constraints (weighted):</w:t>
+      </w:r>
+      <w:r>
+        <w:t xml:space="preserve"> dormant midstream/feedstock (5); capital &amp; long lead time (5); energy reliability (4).</w:t>
+      </w:r>
+    </w:p>
+    <w:p>
+      <w:pPr>
+        <w:pStyle w:val="ListBullet"/>
+      </w:pPr>
+      <w:r>
+        <w:rPr>
+          <w:b/>
+        </w:rPr>
+        <w:t>Priorities:</w:t>
+      </w:r>
+      <w:r>
+        <w:t xml:space="preserve"> ① Insulated wire &amp; cable (expand) ② Kilembe cathode &amp; cobalt (revive) ③ Copper wire rod/semi-fabrication.</w:t>
+      </w:r>
+    </w:p>
+    <w:p>
+      <w:pPr>
+        <w:pStyle w:val="ListBullet"/>
+      </w:pPr>
+      <w:r>
+        <w:rPr>
+          <w:b/>
+        </w:rPr>
+        <w:t>2040 (tenfold):</w:t>
+      </w:r>
+      <w:r>
+        <w:t xml:space="preserve"> cable demand several-fold on electrification → order of </w:t>
+      </w:r>
+      <w:r>
+        <w:rPr>
+          <w:b/>
+        </w:rPr>
+        <w:t>USD 300–500m+/yr</w:t>
+      </w:r>
+      <w:r>
+        <w:t>.</w:t>
+      </w:r>
+    </w:p>
+    <w:p>
+      <w:pPr>
+        <w:pStyle w:val="ListBullet"/>
+      </w:pPr>
+      <w:r>
+        <w:rPr>
+          <w:b/>
+        </w:rPr>
+        <w:t>Green edge:</w:t>
+      </w:r>
+      <w:r>
+        <w:t xml:space="preserve"> hydro electro-refining; cobalt for batteries; tailings reprocessing; scrap recycling.</w:t>
+      </w:r>
+    </w:p>
+    <w:p>
+      <w:pPr>
+        <w:pStyle w:val="Heading2"/>
+      </w:pPr>
+      <w:r>
+        <w:t>A.3 Automotive — Status Snapshot</w:t>
+      </w:r>
+    </w:p>
+    <w:tbl>
+      <w:tblPr>
+        <w:tblStyle w:val="TableGrid"/>
+        <w:tblW w:type="auto" w:w="0"/>
+        <w:jc w:val="left"/>
+        <w:tblLook w:firstColumn="1" w:firstRow="1" w:lastColumn="0" w:lastRow="0" w:noHBand="0" w:noVBand="1" w:val="04A0"/>
+      </w:tblPr>
+      <w:tblGrid>
+        <w:gridCol w:w="4703"/>
+        <w:gridCol w:w="4703"/>
+      </w:tblGrid>
+      <w:tr>
+        <w:tc>
+          <w:tcPr>
+            <w:tcW w:type="dxa" w:w="4703"/>
+            <w:shd w:val="clear" w:color="auto" w:fill="002B5B"/>
+          </w:tcPr>
+          <w:p>
+            <w:r>
+              <w:rPr>
+                <w:b/>
+                <w:color w:val="FFFFFF"/>
+                <w:sz w:val="18"/>
+              </w:rPr>
+              <w:t>Indicator</w:t>
+            </w:r>
+          </w:p>
+        </w:tc>
+        <w:tc>
+          <w:tcPr>
+            <w:tcW w:type="dxa" w:w="4703"/>
+            <w:shd w:val="clear" w:color="auto" w:fill="002B5B"/>
+          </w:tcPr>
+          <w:p>
+            <w:r>
+              <w:rPr>
+                <w:b/>
+                <w:color w:val="FFFFFF"/>
+                <w:sz w:val="18"/>
+              </w:rPr>
+              <w:t>Value</w:t>
+            </w:r>
+          </w:p>
+        </w:tc>
+      </w:tr>
+      <w:tr>
+        <w:tc>
+          <w:tcPr>
+            <w:tcW w:type="dxa" w:w="4703"/>
+            <w:shd w:val="clear" w:color="auto" w:fill="EEF3F9"/>
+          </w:tcPr>
+          <w:p>
+            <w:r>
+              <w:rPr>
+                <w:sz w:val="18"/>
+              </w:rPr>
+              <w:t>Flagship</w:t>
+            </w:r>
+          </w:p>
+        </w:tc>
+        <w:tc>
+          <w:tcPr>
+            <w:tcW w:type="dxa" w:w="4703"/>
+            <w:shd w:val="clear" w:color="auto" w:fill="EEF3F9"/>
+          </w:tcPr>
+          <w:p>
+            <w:r>
+              <w:rPr>
+                <w:sz w:val="18"/>
+              </w:rPr>
+              <w:t xml:space="preserve">Kiira Vehicle Plant, Jinja — </w:t>
+            </w:r>
+            <w:r>
+              <w:rPr>
+                <w:b/>
+                <w:sz w:val="18"/>
+              </w:rPr>
+              <w:t>commissioned 27 Sep 2025</w:t>
+            </w:r>
+          </w:p>
+        </w:tc>
+      </w:tr>
+      <w:tr>
+        <w:tc>
+          <w:tcPr>
+            <w:tcW w:type="dxa" w:w="4703"/>
+            <w:shd w:val="clear" w:color="auto" w:fill="FFFFFF"/>
+          </w:tcPr>
+          <w:p>
+            <w:r>
+              <w:rPr>
+                <w:sz w:val="18"/>
+              </w:rPr>
+              <w:t>Capacity</w:t>
+            </w:r>
+          </w:p>
+        </w:tc>
+        <w:tc>
+          <w:tcPr>
+            <w:tcW w:type="dxa" w:w="4703"/>
+            <w:shd w:val="clear" w:color="auto" w:fill="FFFFFF"/>
+          </w:tcPr>
+          <w:p>
+            <w:r>
+              <w:rPr>
+                <w:sz w:val="18"/>
+              </w:rPr>
+              <w:t>~2,500 veh/yr → target 10,000</w:t>
+            </w:r>
+          </w:p>
+        </w:tc>
+      </w:tr>
+      <w:tr>
+        <w:tc>
+          <w:tcPr>
+            <w:tcW w:type="dxa" w:w="4703"/>
+            <w:shd w:val="clear" w:color="auto" w:fill="EEF3F9"/>
+          </w:tcPr>
+          <w:p>
+            <w:r>
+              <w:rPr>
+                <w:sz w:val="18"/>
+              </w:rPr>
+              <w:t>Vehicle + parts imports</w:t>
+            </w:r>
+          </w:p>
+        </w:tc>
+        <w:tc>
+          <w:tcPr>
+            <w:tcW w:type="dxa" w:w="4703"/>
+            <w:shd w:val="clear" w:color="auto" w:fill="EEF3F9"/>
+          </w:tcPr>
+          <w:p>
+            <w:r>
+              <w:rPr>
+                <w:b/>
+                <w:sz w:val="18"/>
+              </w:rPr>
+              <w:t>&gt; USD 650m/yr</w:t>
+            </w:r>
+          </w:p>
+        </w:tc>
+      </w:tr>
+      <w:tr>
+        <w:tc>
+          <w:tcPr>
+            <w:tcW w:type="dxa" w:w="4703"/>
+            <w:shd w:val="clear" w:color="auto" w:fill="FFFFFF"/>
+          </w:tcPr>
+          <w:p>
+            <w:r>
+              <w:rPr>
+                <w:sz w:val="18"/>
+              </w:rPr>
+              <w:t>Used vehicles imported</w:t>
+            </w:r>
+          </w:p>
+        </w:tc>
+        <w:tc>
+          <w:tcPr>
+            <w:tcW w:type="dxa" w:w="4703"/>
+            <w:shd w:val="clear" w:color="auto" w:fill="FFFFFF"/>
+          </w:tcPr>
+          <w:p>
+            <w:r>
+              <w:rPr>
+                <w:sz w:val="18"/>
+              </w:rPr>
+              <w:t>~48,700/yr</w:t>
+            </w:r>
+          </w:p>
+        </w:tc>
+      </w:tr>
+      <w:tr>
+        <w:tc>
+          <w:tcPr>
+            <w:tcW w:type="dxa" w:w="4703"/>
+            <w:shd w:val="clear" w:color="auto" w:fill="EEF3F9"/>
+          </w:tcPr>
+          <w:p>
+            <w:r>
+              <w:rPr>
+                <w:sz w:val="18"/>
+              </w:rPr>
+              <w:t>Motorcycle imports (HS 8711)</w:t>
+            </w:r>
+          </w:p>
+        </w:tc>
+        <w:tc>
+          <w:tcPr>
+            <w:tcW w:type="dxa" w:w="4703"/>
+            <w:shd w:val="clear" w:color="auto" w:fill="EEF3F9"/>
+          </w:tcPr>
+          <w:p>
+            <w:r>
+              <w:rPr>
+                <w:sz w:val="18"/>
+              </w:rPr>
+              <w:t>USD 157.1m</w:t>
+            </w:r>
+          </w:p>
+        </w:tc>
+      </w:tr>
+      <w:tr>
+        <w:tc>
+          <w:tcPr>
+            <w:tcW w:type="dxa" w:w="4703"/>
+            <w:shd w:val="clear" w:color="auto" w:fill="FFFFFF"/>
+          </w:tcPr>
+          <w:p>
+            <w:r>
+              <w:rPr>
+                <w:sz w:val="18"/>
+              </w:rPr>
+              <w:t>KMC financing gap</w:t>
+            </w:r>
+          </w:p>
+        </w:tc>
+        <w:tc>
+          <w:tcPr>
+            <w:tcW w:type="dxa" w:w="4703"/>
+            <w:shd w:val="clear" w:color="auto" w:fill="FFFFFF"/>
+          </w:tcPr>
+          <w:p>
+            <w:r>
+              <w:rPr>
+                <w:sz w:val="18"/>
+              </w:rPr>
+              <w:t>~UGX 50bn (FY25/26)</w:t>
+            </w:r>
+          </w:p>
+        </w:tc>
+      </w:tr>
+    </w:tbl>
+    <w:p/>
+    <w:p>
+      <w:pPr>
+        <w:pStyle w:val="ListBullet"/>
+      </w:pPr>
+      <w:r>
+        <w:rPr>
+          <w:b/>
+        </w:rPr>
+        <w:t>Position:</w:t>
+      </w:r>
+      <w:r>
+        <w:t xml:space="preserve"> early, state-anchored assembly (KMC + motorcycle assembly); market dominated by used imports.</w:t>
+      </w:r>
+    </w:p>
+    <w:p>
+      <w:pPr>
+        <w:pStyle w:val="ListBullet"/>
+      </w:pPr>
+      <w:r>
+        <w:rPr>
+          <w:b/>
+        </w:rPr>
+        <w:t>Top constraints (weighted):</w:t>
+      </w:r>
+      <w:r>
+        <w:t xml:space="preserve"> finance/capital for scale-up (5); shallow local content (4); demand policy / used-import competition (4).</w:t>
+      </w:r>
+    </w:p>
+    <w:p>
+      <w:pPr>
+        <w:pStyle w:val="ListBullet"/>
+      </w:pPr>
+      <w:r>
+        <w:rPr>
+          <w:b/>
+        </w:rPr>
+        <w:t>Priorities:</w:t>
+      </w:r>
+      <w:r>
+        <w:t xml:space="preserve"> ① Buses / EV buses (KMC) ② Motorcycle assembly (CKD → e-boda) ③ Spare-parts &amp; component localisation.</w:t>
+      </w:r>
+    </w:p>
+    <w:p>
+      <w:pPr>
+        <w:pStyle w:val="ListBullet"/>
+      </w:pPr>
+      <w:r>
+        <w:rPr>
+          <w:b/>
+        </w:rPr>
+        <w:t>2040 (tenfold):</w:t>
+      </w:r>
+      <w:r>
+        <w:t xml:space="preserve"> multi-fold mobility demand — capture via domestic assembly vs. the USD 650m+ import leak.</w:t>
+      </w:r>
+    </w:p>
+    <w:p>
+      <w:pPr>
+        <w:pStyle w:val="ListBullet"/>
+      </w:pPr>
+      <w:r>
+        <w:rPr>
+          <w:b/>
+        </w:rPr>
+        <w:t>Green edge:</w:t>
+      </w:r>
+      <w:r>
+        <w:t xml:space="preserve"> electric buses (Kayoola) and e-boda on the hydro grid; battery link to Kilembe cobalt.</w:t>
+      </w:r>
+    </w:p>
+    <w:p>
+      <w:r>
+        <w:rPr>
+          <w:i/>
+        </w:rPr>
+        <w:t>Full analysis: Chapters 4–6. Sources: consolidated References.</w:t>
       </w:r>
     </w:p>
     <w:p>

</xml_diff>

<commit_message>
QA pass: fix data/consistency issues found in review
- Correct outdated EAC intra-regional trade figure (~USD 4.8bn -> ~USD 12bn 2023,
  rising to ~USD 18bn by mid-2025; verified vs EAC/Ecofin).
- Reconcile electricity claim in both cross-cutting chapters: dedicated extra-large
  tariff ~5.5c helps largest loads, but effective industrial tariff ~8-10c is
  higher than peers and reliability is the #1 firm-cited issue (matches NPA/UDC).
- Remove remaining 'desk-based' framing in both executive summaries (TWG-primary).
All trade figures verified exact against data/trademap CSVs; steel figures vs
NPA/UDC; per-capita steel + electrification vs web.

Co-Authored-By: Claude Opus 4.8 <noreply@anthropic.com>
</commit_message>
<xml_diff>
--- a/report/Report-1-Iron-Steel-Copper-Automotive.docx
+++ b/report/Report-1-Iron-Steel-Copper-Automotive.docx
@@ -2818,7 +2818,7 @@
         <w:rPr>
           <w:i/>
         </w:rPr>
-        <w:t>This summary reflects desk-based findings to be confirmed through the validation step in Chapter 3.</w:t>
+        <w:t>This summary reflects findings from TWG sector-expert engagement and supporting evidence, to be confirmed through the continued validation in Chapter 3.</w:t>
       </w:r>
     </w:p>
     <w:p>
@@ -9022,7 +9022,7 @@
               <w:rPr>
                 <w:sz w:val="18"/>
               </w:rPr>
-              <w:t>EAC intra-regional trade ~USD 4.8bn; Uganda competitive in rebar to S. Sudan &amp; eastern DRC (USD 55.8m, 2024)</w:t>
+              <w:t>Intra-EAC trade ~USD 12bn (2023), rising toward ~USD 18bn by mid-2025; Uganda competitive in rebar to S. Sudan &amp; eastern DRC (USD 55.8m, 2024)</w:t>
             </w:r>
           </w:p>
         </w:tc>
@@ -21404,16 +21404,34 @@
         <w:t>1. Energy cost and reliability.</w:t>
       </w:r>
       <w:r>
-        <w:t xml:space="preserve"> Metals processing (DRI, electro-refining, rolling) is electricity-intensive. Uganda's extra-large industrial tariff is around </w:t>
+        <w:t xml:space="preserve"> Metals processing (DRI, electro-refining, rolling) is electricity-intensive. A dedicated </w:t>
       </w:r>
       <w:r>
         <w:rPr>
           <w:b/>
         </w:rPr>
-        <w:t>5.5 US¢/kWh (5¢ off-peak) in 2025</w:t>
-      </w:r>
-      <w:r>
-        <w:t xml:space="preserve"> (Electricity Regulatory Authority) — regionally competitive — but reliability and the cost of self-generation backup erode this advantage. The 2025 transition from UMEME to UEDCL as distributor is an opportunity to lock in industrial reliability commitments.</w:t>
+        <w:t>extra-large-load tariff (~5.5 US¢/kWh, ERA 2025)</w:t>
+      </w:r>
+      <w:r>
+        <w:t xml:space="preserve"> helps the very largest plants, but the </w:t>
+      </w:r>
+      <w:r>
+        <w:rPr>
+          <w:b/>
+        </w:rPr>
+        <w:t>effective/general industrial tariff is ~8–10 US¢/kWh — higher than Kenya (5–7), Tanzania (6–8) and Egypt (4–5)</w:t>
+      </w:r>
+      <w:r>
+        <w:t xml:space="preserve"> (NPA/UDC 2025) — and power </w:t>
+      </w:r>
+      <w:r>
+        <w:rPr>
+          <w:b/>
+        </w:rPr>
+        <w:t>reliability is the single issue firms cite most</w:t>
+      </w:r>
+      <w:r>
+        <w:t>. The 2025 transition from UMEME to UEDCL as distributor is an opportunity to lock in industrial reliability commitments and competitive large-load tariffs.</w:t>
       </w:r>
     </w:p>
     <w:p>

</xml_diff>

<commit_message>
Final QA: exhaust NPA/UDC source + complete references
- Add Kigezi iron-ore exploration-licence detail and the NPA/UDC mine-cost figure
  (~USD 6.73m for a 1 Mtpa mine) to Iron & Steel, fully mining the primary source.
- Complete consolidated references: add UBOS (now primary statistics source),
  State House Uganda, EAC/Ecofin (R1); UBOS, MAAIF, AGOA (R2) — all were cited but
  missing after the chapter rewrites stripped per-chapter ref lists.

Co-Authored-By: Claude Opus 4.8 <noreply@anthropic.com>
</commit_message>
<xml_diff>
--- a/report/Report-1-Iron-Steel-Copper-Automotive.docx
+++ b/report/Report-1-Iron-Steel-Copper-Automotive.docx
@@ -7826,6 +7826,35 @@
       </w:r>
       <w:r>
         <w:t xml:space="preserve"> plants exist — Tembo (Iganga, 350,000 tpa) and Abyssinia (Jinja, 30,000 tpa) — together ~400,000 tpa, but they lack sufficient domestic ore and so cannot run at scale; Phase II is just ~5% of players (NPA/UDC, 2025).</w:t>
+      </w:r>
+    </w:p>
+    <w:p>
+      <w:r>
+        <w:rPr>
+          <w:b/>
+        </w:rPr>
+        <w:t>Upstream (mining) is licensed but undeveloped.</w:t>
+      </w:r>
+      <w:r>
+        <w:t xml:space="preserve"> Active iron-ore exploration and location licences are concentrated in </w:t>
+      </w:r>
+      <w:r>
+        <w:rPr>
+          <w:b/>
+        </w:rPr>
+        <w:t>Kigezi (Rubanda, Rukiga, Kabale, Kisoro)</w:t>
+      </w:r>
+      <w:r>
+        <w:t xml:space="preserve">, held by firms including Diamond Steel Uganda, Kamuntu Investments and others (NPA/UDC, 2025) — the south-western mining frontier — yet commercial-scale extraction has not followed. NPA/UDC estimates that establishing a </w:t>
+      </w:r>
+      <w:r>
+        <w:rPr>
+          <w:b/>
+        </w:rPr>
+        <w:t>1,000,000 tpa (≈4,000 t/day) commercial iron-ore mine would cost ~USD 6.73 million</w:t>
+      </w:r>
+      <w:r>
+        <w:t xml:space="preserve"> — a modest sum relative to the downstream value it unlocks.</w:t>
       </w:r>
     </w:p>
     <w:p>
@@ -11800,7 +11829,7 @@
               <w:rPr>
                 <w:sz w:val="18"/>
               </w:rPr>
-              <w:t>Establish a ≥1,000,000 tpa commercial iron-ore mine (UNMC/UDC or scale SINO Minerals); resolve land access at Muko/Mutaka</w:t>
+              <w:t>Establish a ≥1,000,000 tpa commercial iron-ore mine (UNMC/UDC or scale SINO Minerals); resolve land access at Muko/Mutaka &amp; Kigezi licences</w:t>
             </w:r>
           </w:p>
         </w:tc>
@@ -11828,7 +11857,7 @@
               <w:rPr>
                 <w:sz w:val="18"/>
               </w:rPr>
-              <w:t>Medium</w:t>
+              <w:t>~USD 6.73m (mine, NPA/UDC)</w:t>
             </w:r>
           </w:p>
         </w:tc>
@@ -25533,6 +25562,23 @@
         <w:pStyle w:val="ListBullet"/>
       </w:pPr>
       <w:r>
+        <w:t xml:space="preserve">Uganda Bureau of Statistics (UBOS), </w:t>
+      </w:r>
+      <w:r>
+        <w:rPr>
+          <w:i/>
+        </w:rPr>
+        <w:t>Statistical Abstract</w:t>
+      </w:r>
+      <w:r>
+        <w:t xml:space="preserve"> and national/industrial accounts (production, employment, GDP, electrification). https://www.ubos.org/</w:t>
+      </w:r>
+    </w:p>
+    <w:p>
+      <w:pPr>
+        <w:pStyle w:val="ListBullet"/>
+      </w:pPr>
+      <w:r>
         <w:t xml:space="preserve">World Bank, </w:t>
       </w:r>
       <w:r>
@@ -25543,6 +25589,22 @@
       </w:r>
       <w:r>
         <w:t>. https://data.worldbank.org/indicator/NV.IND.MANF.ZS?locations=UG</w:t>
+      </w:r>
+    </w:p>
+    <w:p>
+      <w:pPr>
+        <w:pStyle w:val="ListBullet"/>
+      </w:pPr>
+      <w:r>
+        <w:t>State House Uganda, "President Museveni commissions new Tembo Steels plant in Iganga" (2025). https://statehouse.go.ug/</w:t>
+      </w:r>
+    </w:p>
+    <w:p>
+      <w:pPr>
+        <w:pStyle w:val="ListBullet"/>
+      </w:pPr>
+      <w:r>
+        <w:t>East African Community, intra-regional trade data. https://www.eac.int/ ; Ecofin Agency, "East African Community trade rises 22% in 2024, topping $11bn" (2025). https://www.ecofinagency.com/</w:t>
       </w:r>
     </w:p>
     <w:p>

</xml_diff>